<commit_message>
Update HTYN version 1.0 build 2025.09.19.
</commit_message>
<xml_diff>
--- a/articles/finished/PhapQuyen.docx
+++ b/articles/finished/PhapQuyen.docx
@@ -361,6 +361,7 @@
           <w:id w:val="1063754076"/>
           <w:citation/>
         </w:sdtPr>
+        <w:sdtEndPr/>
         <w:sdtContent>
           <w:r>
             <w:fldChar w:fldCharType="begin"/>
@@ -450,6 +451,7 @@
           <w:id w:val="592520875"/>
           <w:citation/>
         </w:sdtPr>
+        <w:sdtEndPr/>
         <w:sdtContent>
           <w:r>
             <w:fldChar w:fldCharType="begin"/>
@@ -548,6 +550,7 @@
           <w:id w:val="-496726558"/>
           <w:citation/>
         </w:sdtPr>
+        <w:sdtEndPr/>
         <w:sdtContent>
           <w:r>
             <w:rPr>
@@ -610,6 +613,7 @@
           <w:id w:val="-1800063771"/>
           <w:citation/>
         </w:sdtPr>
+        <w:sdtEndPr/>
         <w:sdtContent>
           <w:r>
             <w:fldChar w:fldCharType="begin"/>
@@ -721,6 +725,7 @@
           <w:id w:val="2046788621"/>
           <w:citation/>
         </w:sdtPr>
+        <w:sdtEndPr/>
         <w:sdtContent>
           <w:r>
             <w:fldChar w:fldCharType="begin"/>
@@ -801,6 +806,7 @@
           <w:id w:val="-1761437841"/>
           <w:citation/>
         </w:sdtPr>
+        <w:sdtEndPr/>
         <w:sdtContent>
           <w:r>
             <w:fldChar w:fldCharType="begin"/>
@@ -893,6 +899,7 @@
           <w:id w:val="269829449"/>
           <w:citation/>
         </w:sdtPr>
+        <w:sdtEndPr/>
         <w:sdtContent>
           <w:r>
             <w:fldChar w:fldCharType="begin"/>
@@ -928,6 +935,7 @@
           <w:id w:val="-763225325"/>
           <w:citation/>
         </w:sdtPr>
+        <w:sdtEndPr/>
         <w:sdtContent>
           <w:r>
             <w:fldChar w:fldCharType="begin"/>
@@ -1010,6 +1018,7 @@
           <w:id w:val="-2139559250"/>
           <w:citation/>
         </w:sdtPr>
+        <w:sdtEndPr/>
         <w:sdtContent>
           <w:r>
             <w:fldChar w:fldCharType="begin"/>
@@ -1328,6 +1337,7 @@
           <w:id w:val="1205295772"/>
           <w:citation/>
         </w:sdtPr>
+        <w:sdtEndPr/>
         <w:sdtContent>
           <w:r>
             <w:fldChar w:fldCharType="begin"/>
@@ -1459,6 +1469,7 @@
           <w:id w:val="-1220284408"/>
           <w:citation/>
         </w:sdtPr>
+        <w:sdtEndPr/>
         <w:sdtContent>
           <w:r>
             <w:fldChar w:fldCharType="begin"/>
@@ -1664,10 +1675,21 @@
         <w:t xml:space="preserve">). </w:t>
       </w:r>
       <w:r>
-        <w:rPr>
-          <w:i/>
-        </w:rPr>
-        <w:t>Quan năng</w:t>
+        <w:t xml:space="preserve">Lưu ý, moment trong triết học Đức có nghĩa chính là khía cạnh, giai đoạn, thành phần trong quá trình biện chứng. </w:t>
+      </w:r>
+      <w:proofErr w:type="gramStart"/>
+      <w:r>
+        <w:rPr>
+          <w:i/>
+        </w:rPr>
+        <w:t>Quan</w:t>
+      </w:r>
+      <w:proofErr w:type="gramEnd"/>
+      <w:r>
+        <w:rPr>
+          <w:i/>
+        </w:rPr>
+        <w:t xml:space="preserve"> năng</w:t>
       </w:r>
       <w:r>
         <w:t xml:space="preserve"> (</w:t>
@@ -1802,11 +1824,11 @@
         <w:t>Định chế</w:t>
       </w:r>
       <w:r>
-        <w:t xml:space="preserve"> cũng là những luật định, quy định, </w:t>
+        <w:t xml:space="preserve"> cũng là những luật </w:t>
       </w:r>
       <w:r>
         <w:lastRenderedPageBreak/>
-        <w:t>quy luật, quy tắc như luật pháp nhưng có mục đích rõ ràng nhưng không đặt nặng và/hoặc chưa quan tâm tính hợp pháp, hợp lệ.</w:t>
+        <w:t>định, quy định, quy luật, quy tắc như luật pháp nhưng có mục đích rõ ràng nhưng không đặt nặng và/hoặc chưa quan tâm tính hợp pháp, hợp lệ.</w:t>
       </w:r>
     </w:p>
     <w:p>
@@ -2426,7 +2448,18 @@
         <w:t>oment</w:t>
       </w:r>
       <w:r>
-        <w:t xml:space="preserve"> là thuộc tính</w:t>
+        <w:t xml:space="preserve"> là </w:t>
+      </w:r>
+      <w:r>
+        <w:t xml:space="preserve">khía cạnh, giai đoạn, </w:t>
+      </w:r>
+      <w:bookmarkStart w:id="2" w:name="_GoBack"/>
+      <w:bookmarkEnd w:id="2"/>
+      <w:r>
+        <w:t xml:space="preserve">thành phần, </w:t>
+      </w:r>
+      <w:r>
+        <w:t>thuộc tính</w:t>
       </w:r>
       <w:r>
         <w:t xml:space="preserve">, </w:t>
@@ -2475,6 +2508,7 @@
           <w:id w:val="766113225"/>
           <w:citation/>
         </w:sdtPr>
+        <w:sdtEndPr/>
         <w:sdtContent>
           <w:r>
             <w:fldChar w:fldCharType="begin"/>
@@ -2656,6 +2690,7 @@
           <w:id w:val="1310673331"/>
           <w:citation/>
         </w:sdtPr>
+        <w:sdtEndPr/>
         <w:sdtContent>
           <w:r>
             <w:fldChar w:fldCharType="begin"/>
@@ -2766,6 +2801,7 @@
           <w:id w:val="-696540182"/>
           <w:citation/>
         </w:sdtPr>
+        <w:sdtEndPr/>
         <w:sdtContent>
           <w:r>
             <w:fldChar w:fldCharType="begin"/>
@@ -2867,6 +2903,7 @@
           <w:id w:val="1843890578"/>
           <w:citation/>
         </w:sdtPr>
+        <w:sdtEndPr/>
         <w:sdtContent>
           <w:r>
             <w:fldChar w:fldCharType="begin"/>
@@ -3094,6 +3131,7 @@
           <w:id w:val="1934779701"/>
           <w:citation/>
         </w:sdtPr>
+        <w:sdtEndPr/>
         <w:sdtContent>
           <w:r>
             <w:fldChar w:fldCharType="begin"/>
@@ -3431,6 +3469,7 @@
           <w:id w:val="-146830703"/>
           <w:citation/>
         </w:sdtPr>
+        <w:sdtEndPr/>
         <w:sdtContent>
           <w:r>
             <w:fldChar w:fldCharType="begin"/>
@@ -3463,6 +3502,7 @@
           <w:id w:val="1601525030"/>
           <w:citation/>
         </w:sdtPr>
+        <w:sdtEndPr/>
         <w:sdtContent>
           <w:r>
             <w:fldChar w:fldCharType="begin"/>
@@ -3502,6 +3542,7 @@
           <w:id w:val="-741101290"/>
           <w:citation/>
         </w:sdtPr>
+        <w:sdtEndPr/>
         <w:sdtContent>
           <w:r>
             <w:fldChar w:fldCharType="begin"/>
@@ -3537,6 +3578,7 @@
           <w:id w:val="212699674"/>
           <w:citation/>
         </w:sdtPr>
+        <w:sdtEndPr/>
         <w:sdtContent>
           <w:r>
             <w:fldChar w:fldCharType="begin"/>
@@ -3587,6 +3629,7 @@
           <w:id w:val="-1081751291"/>
           <w:citation/>
         </w:sdtPr>
+        <w:sdtEndPr/>
         <w:sdtContent>
           <w:r>
             <w:fldChar w:fldCharType="begin"/>
@@ -3622,6 +3665,7 @@
           <w:id w:val="-1244178902"/>
           <w:citation/>
         </w:sdtPr>
+        <w:sdtEndPr/>
         <w:sdtContent>
           <w:r>
             <w:fldChar w:fldCharType="begin"/>
@@ -3675,6 +3719,7 @@
           <w:id w:val="1765491281"/>
           <w:citation/>
         </w:sdtPr>
+        <w:sdtEndPr/>
         <w:sdtContent>
           <w:r>
             <w:fldChar w:fldCharType="begin"/>
@@ -3713,6 +3758,7 @@
           <w:id w:val="1837416621"/>
           <w:citation/>
         </w:sdtPr>
+        <w:sdtEndPr/>
         <w:sdtContent>
           <w:r>
             <w:fldChar w:fldCharType="begin"/>
@@ -3745,6 +3791,7 @@
           <w:id w:val="668223430"/>
           <w:citation/>
         </w:sdtPr>
+        <w:sdtEndPr/>
         <w:sdtContent>
           <w:r>
             <w:fldChar w:fldCharType="begin"/>
@@ -3774,6 +3821,7 @@
           <w:id w:val="-1202775739"/>
           <w:citation/>
         </w:sdtPr>
+        <w:sdtEndPr/>
         <w:sdtContent>
           <w:r>
             <w:fldChar w:fldCharType="begin"/>
@@ -4003,6 +4051,7 @@
           <w:id w:val="684487328"/>
           <w:citation/>
         </w:sdtPr>
+        <w:sdtEndPr/>
         <w:sdtContent>
           <w:r>
             <w:fldChar w:fldCharType="begin"/>
@@ -4074,6 +4123,7 @@
           <w:id w:val="247242433"/>
           <w:citation/>
         </w:sdtPr>
+        <w:sdtEndPr/>
         <w:sdtContent>
           <w:r>
             <w:fldChar w:fldCharType="begin"/>
@@ -4130,6 +4180,7 @@
           <w:id w:val="1182015710"/>
           <w:citation/>
         </w:sdtPr>
+        <w:sdtEndPr/>
         <w:sdtContent>
           <w:r>
             <w:fldChar w:fldCharType="begin"/>
@@ -4252,6 +4303,7 @@
           <w:id w:val="21209700"/>
           <w:citation/>
         </w:sdtPr>
+        <w:sdtEndPr/>
         <w:sdtContent>
           <w:r>
             <w:fldChar w:fldCharType="begin"/>
@@ -4372,6 +4424,7 @@
           <w:id w:val="929861285"/>
           <w:citation/>
         </w:sdtPr>
+        <w:sdtEndPr/>
         <w:sdtContent>
           <w:r>
             <w:fldChar w:fldCharType="begin"/>
@@ -4751,6 +4804,7 @@
           <w:id w:val="2106463083"/>
           <w:citation/>
         </w:sdtPr>
+        <w:sdtEndPr/>
         <w:sdtContent>
           <w:r>
             <w:fldChar w:fldCharType="begin"/>
@@ -4792,6 +4846,7 @@
           <w:id w:val="67390205"/>
           <w:citation/>
         </w:sdtPr>
+        <w:sdtEndPr/>
         <w:sdtContent>
           <w:r>
             <w:fldChar w:fldCharType="begin"/>
@@ -4821,6 +4876,7 @@
           <w:id w:val="1273369279"/>
           <w:citation/>
         </w:sdtPr>
+        <w:sdtEndPr/>
         <w:sdtContent>
           <w:r>
             <w:fldChar w:fldCharType="begin"/>
@@ -4874,6 +4930,7 @@
           <w:id w:val="79100171"/>
           <w:citation/>
         </w:sdtPr>
+        <w:sdtEndPr/>
         <w:sdtContent>
           <w:r>
             <w:fldChar w:fldCharType="begin"/>
@@ -4939,6 +4996,7 @@
           <w:id w:val="-1519148699"/>
           <w:citation/>
         </w:sdtPr>
+        <w:sdtEndPr/>
         <w:sdtContent>
           <w:r>
             <w:fldChar w:fldCharType="begin"/>
@@ -5025,6 +5083,7 @@
           <w:id w:val="-959102537"/>
           <w:citation/>
         </w:sdtPr>
+        <w:sdtEndPr/>
         <w:sdtContent>
           <w:r>
             <w:fldChar w:fldCharType="begin"/>
@@ -5117,6 +5176,7 @@
           <w:id w:val="-756664594"/>
           <w:citation/>
         </w:sdtPr>
+        <w:sdtEndPr/>
         <w:sdtContent>
           <w:r>
             <w:fldChar w:fldCharType="begin"/>
@@ -5150,7 +5210,7 @@
       <w:pPr>
         <w:pStyle w:val="Heading1"/>
       </w:pPr>
-      <w:bookmarkStart w:id="2" w:name="_Toc207378964"/>
+      <w:bookmarkStart w:id="3" w:name="_Toc207378964"/>
       <w:r>
         <w:t>1</w:t>
       </w:r>
@@ -5160,17 +5220,17 @@
       <w:r>
         <w:t>Pháp quyền trừu tượng</w:t>
       </w:r>
-      <w:bookmarkEnd w:id="2"/>
+      <w:bookmarkEnd w:id="3"/>
     </w:p>
     <w:p>
       <w:pPr>
         <w:pStyle w:val="Heading2"/>
       </w:pPr>
-      <w:bookmarkStart w:id="3" w:name="_Toc207378965"/>
+      <w:bookmarkStart w:id="4" w:name="_Toc207378965"/>
       <w:r>
         <w:t>1.1. Pháp quyền trừu tượng</w:t>
       </w:r>
-      <w:bookmarkEnd w:id="3"/>
+      <w:bookmarkEnd w:id="4"/>
     </w:p>
     <w:p>
       <w:r>
@@ -5181,6 +5241,7 @@
           <w:id w:val="1075706672"/>
           <w:citation/>
         </w:sdtPr>
+        <w:sdtEndPr/>
         <w:sdtContent>
           <w:r>
             <w:fldChar w:fldCharType="begin"/>
@@ -5717,6 +5778,7 @@
           <w:id w:val="-407533097"/>
           <w:citation/>
         </w:sdtPr>
+        <w:sdtEndPr/>
         <w:sdtContent>
           <w:r>
             <w:fldChar w:fldCharType="begin"/>
@@ -5976,6 +6038,7 @@
           <w:id w:val="557287642"/>
           <w:citation/>
         </w:sdtPr>
+        <w:sdtEndPr/>
         <w:sdtContent>
           <w:r>
             <w:rPr>
@@ -6048,6 +6111,7 @@
           <w:id w:val="1116409960"/>
           <w:citation/>
         </w:sdtPr>
+        <w:sdtEndPr/>
         <w:sdtContent>
           <w:r>
             <w:rPr>
@@ -6182,6 +6246,7 @@
           <w:id w:val="-428583721"/>
           <w:citation/>
         </w:sdtPr>
+        <w:sdtEndPr/>
         <w:sdtContent>
           <w:r>
             <w:rPr>
@@ -6296,6 +6361,7 @@
           <w:id w:val="1536541375"/>
           <w:citation/>
         </w:sdtPr>
+        <w:sdtEndPr/>
         <w:sdtContent>
           <w:r>
             <w:rPr>
@@ -6380,6 +6446,7 @@
           <w:id w:val="47500187"/>
           <w:citation/>
         </w:sdtPr>
+        <w:sdtEndPr/>
         <w:sdtContent>
           <w:r>
             <w:rPr>
@@ -6440,6 +6507,7 @@
           <w:id w:val="1628514087"/>
           <w:citation/>
         </w:sdtPr>
+        <w:sdtEndPr/>
         <w:sdtContent>
           <w:r>
             <w:rPr>
@@ -6567,6 +6635,7 @@
           <w:id w:val="1054817089"/>
           <w:citation/>
         </w:sdtPr>
+        <w:sdtEndPr/>
         <w:sdtContent>
           <w:r>
             <w:rPr>
@@ -6649,6 +6718,7 @@
           <w:id w:val="649796996"/>
           <w:citation/>
         </w:sdtPr>
+        <w:sdtEndPr/>
         <w:sdtContent>
           <w:r>
             <w:rPr>
@@ -6723,6 +6793,7 @@
           <w:id w:val="495075868"/>
           <w:citation/>
         </w:sdtPr>
+        <w:sdtEndPr/>
         <w:sdtContent>
           <w:r>
             <w:rPr>
@@ -6936,6 +7007,7 @@
           <w:id w:val="-1198311028"/>
           <w:citation/>
         </w:sdtPr>
+        <w:sdtEndPr/>
         <w:sdtContent>
           <w:r>
             <w:rPr>
@@ -7039,6 +7111,7 @@
           <w:id w:val="-435060589"/>
           <w:citation/>
         </w:sdtPr>
+        <w:sdtEndPr/>
         <w:sdtContent>
           <w:r>
             <w:rPr>
@@ -7142,6 +7215,7 @@
           <w:id w:val="1220397766"/>
           <w:citation/>
         </w:sdtPr>
+        <w:sdtEndPr/>
         <w:sdtContent>
           <w:r>
             <w:rPr>
@@ -7215,6 +7289,7 @@
           <w:id w:val="1454364547"/>
           <w:citation/>
         </w:sdtPr>
+        <w:sdtEndPr/>
         <w:sdtContent>
           <w:r>
             <w:rPr>
@@ -7487,6 +7562,7 @@
           <w:id w:val="1987037831"/>
           <w:citation/>
         </w:sdtPr>
+        <w:sdtEndPr/>
         <w:sdtContent>
           <w:r>
             <w:rPr>
@@ -7547,6 +7623,7 @@
           <w:id w:val="1863318401"/>
           <w:citation/>
         </w:sdtPr>
+        <w:sdtEndPr/>
         <w:sdtContent>
           <w:r>
             <w:rPr>
@@ -7602,6 +7679,7 @@
           <w:id w:val="-1690288117"/>
           <w:citation/>
         </w:sdtPr>
+        <w:sdtEndPr/>
         <w:sdtContent>
           <w:r>
             <w:rPr>
@@ -7657,6 +7735,7 @@
           <w:id w:val="441194399"/>
           <w:citation/>
         </w:sdtPr>
+        <w:sdtEndPr/>
         <w:sdtContent>
           <w:r>
             <w:rPr>
@@ -7724,6 +7803,7 @@
           <w:id w:val="-189079577"/>
           <w:citation/>
         </w:sdtPr>
+        <w:sdtEndPr/>
         <w:sdtContent>
           <w:r>
             <w:rPr>
@@ -7797,6 +7877,7 @@
           <w:id w:val="-2104570613"/>
           <w:citation/>
         </w:sdtPr>
+        <w:sdtEndPr/>
         <w:sdtContent>
           <w:r>
             <w:rPr>
@@ -7915,7 +7996,7 @@
       <w:pPr>
         <w:pStyle w:val="Heading2"/>
       </w:pPr>
-      <w:bookmarkStart w:id="4" w:name="_Toc207378966"/>
+      <w:bookmarkStart w:id="5" w:name="_Toc207378966"/>
       <w:r>
         <w:t>1.2</w:t>
       </w:r>
@@ -7925,7 +8006,7 @@
       <w:r>
         <w:t>Sở hữu &amp; khế ước</w:t>
       </w:r>
-      <w:bookmarkEnd w:id="4"/>
+      <w:bookmarkEnd w:id="5"/>
     </w:p>
     <w:p>
       <w:pPr>
@@ -8067,6 +8148,7 @@
           <w:id w:val="671527830"/>
           <w:citation/>
         </w:sdtPr>
+        <w:sdtEndPr/>
         <w:sdtContent>
           <w:r>
             <w:rPr>
@@ -8447,6 +8529,7 @@
           <w:id w:val="430550560"/>
           <w:citation/>
         </w:sdtPr>
+        <w:sdtEndPr/>
         <w:sdtContent>
           <w:r>
             <w:rPr>
@@ -8773,6 +8856,7 @@
           <w:id w:val="-1327038442"/>
           <w:citation/>
         </w:sdtPr>
+        <w:sdtEndPr/>
         <w:sdtContent>
           <w:r>
             <w:rPr>
@@ -8894,6 +8978,7 @@
           <w:id w:val="1167363263"/>
           <w:citation/>
         </w:sdtPr>
+        <w:sdtEndPr/>
         <w:sdtContent>
           <w:r>
             <w:fldChar w:fldCharType="begin"/>
@@ -8926,6 +9011,7 @@
           <w:id w:val="-430593500"/>
           <w:citation/>
         </w:sdtPr>
+        <w:sdtEndPr/>
         <w:sdtContent>
           <w:r>
             <w:fldChar w:fldCharType="begin"/>
@@ -9027,6 +9113,7 @@
           <w:id w:val="-772860578"/>
           <w:citation/>
         </w:sdtPr>
+        <w:sdtEndPr/>
         <w:sdtContent>
           <w:r>
             <w:rPr>
@@ -9249,6 +9336,7 @@
           <w:id w:val="740286655"/>
           <w:citation/>
         </w:sdtPr>
+        <w:sdtEndPr/>
         <w:sdtContent>
           <w:r>
             <w:rPr>
@@ -9342,6 +9430,7 @@
           <w:id w:val="-1858734137"/>
           <w:citation/>
         </w:sdtPr>
+        <w:sdtEndPr/>
         <w:sdtContent>
           <w:r>
             <w:rPr>
@@ -9475,6 +9564,7 @@
           <w:id w:val="-1273087840"/>
           <w:citation/>
         </w:sdtPr>
+        <w:sdtEndPr/>
         <w:sdtContent>
           <w:r>
             <w:rPr>
@@ -9590,6 +9680,7 @@
           <w:id w:val="-1180495464"/>
           <w:citation/>
         </w:sdtPr>
+        <w:sdtEndPr/>
         <w:sdtContent>
           <w:r>
             <w:rPr>
@@ -9659,6 +9750,7 @@
           <w:id w:val="77805031"/>
           <w:citation/>
         </w:sdtPr>
+        <w:sdtEndPr/>
         <w:sdtContent>
           <w:r>
             <w:rPr>
@@ -9714,6 +9806,7 @@
           <w:id w:val="1487666340"/>
           <w:citation/>
         </w:sdtPr>
+        <w:sdtEndPr/>
         <w:sdtContent>
           <w:r>
             <w:rPr>
@@ -9993,6 +10086,7 @@
           <w:id w:val="787012562"/>
           <w:citation/>
         </w:sdtPr>
+        <w:sdtEndPr/>
         <w:sdtContent>
           <w:r>
             <w:rPr>
@@ -10066,6 +10160,7 @@
           <w:id w:val="-89629322"/>
           <w:citation/>
         </w:sdtPr>
+        <w:sdtEndPr/>
         <w:sdtContent>
           <w:r>
             <w:rPr>
@@ -10145,6 +10240,7 @@
           <w:id w:val="1806351682"/>
           <w:citation/>
         </w:sdtPr>
+        <w:sdtEndPr/>
         <w:sdtContent>
           <w:r>
             <w:rPr>
@@ -10206,6 +10302,7 @@
           <w:id w:val="2136753170"/>
           <w:citation/>
         </w:sdtPr>
+        <w:sdtEndPr/>
         <w:sdtContent>
           <w:r>
             <w:rPr>
@@ -10379,6 +10476,7 @@
           <w:id w:val="-966043682"/>
           <w:citation/>
         </w:sdtPr>
+        <w:sdtEndPr/>
         <w:sdtContent>
           <w:r>
             <w:rPr>
@@ -10489,6 +10587,7 @@
           <w:id w:val="79025476"/>
           <w:citation/>
         </w:sdtPr>
+        <w:sdtEndPr/>
         <w:sdtContent>
           <w:r>
             <w:rPr>
@@ -10586,6 +10685,7 @@
           <w:id w:val="551357315"/>
           <w:citation/>
         </w:sdtPr>
+        <w:sdtEndPr/>
         <w:sdtContent>
           <w:r>
             <w:rPr>
@@ -10669,6 +10769,7 @@
           <w:id w:val="1772048279"/>
           <w:citation/>
         </w:sdtPr>
+        <w:sdtEndPr/>
         <w:sdtContent>
           <w:r>
             <w:rPr>
@@ -10724,6 +10825,7 @@
           <w:id w:val="452907926"/>
           <w:citation/>
         </w:sdtPr>
+        <w:sdtEndPr/>
         <w:sdtContent>
           <w:r>
             <w:rPr>
@@ -10986,6 +11088,7 @@
           <w:id w:val="1201976114"/>
           <w:citation/>
         </w:sdtPr>
+        <w:sdtEndPr/>
         <w:sdtContent>
           <w:r>
             <w:rPr>
@@ -11059,11 +11162,11 @@
       <w:pPr>
         <w:pStyle w:val="Heading2"/>
       </w:pPr>
-      <w:bookmarkStart w:id="5" w:name="_Toc207378967"/>
+      <w:bookmarkStart w:id="6" w:name="_Toc207378967"/>
       <w:r>
         <w:t>1.3. Phi pháp</w:t>
       </w:r>
-      <w:bookmarkEnd w:id="5"/>
+      <w:bookmarkEnd w:id="6"/>
     </w:p>
     <w:p>
       <w:pPr>
@@ -11116,6 +11219,7 @@
           <w:id w:val="336122229"/>
           <w:citation/>
         </w:sdtPr>
+        <w:sdtEndPr/>
         <w:sdtContent>
           <w:r>
             <w:rPr>
@@ -11219,6 +11323,7 @@
           <w:id w:val="-805155748"/>
           <w:citation/>
         </w:sdtPr>
+        <w:sdtEndPr/>
         <w:sdtContent>
           <w:r>
             <w:rPr>
@@ -11346,6 +11451,7 @@
           <w:id w:val="30549480"/>
           <w:citation/>
         </w:sdtPr>
+        <w:sdtEndPr/>
         <w:sdtContent>
           <w:r>
             <w:rPr>
@@ -11477,6 +11583,7 @@
           <w:id w:val="54139668"/>
           <w:citation/>
         </w:sdtPr>
+        <w:sdtEndPr/>
         <w:sdtContent>
           <w:r>
             <w:rPr>
@@ -11645,6 +11752,7 @@
           <w:id w:val="623812237"/>
           <w:citation/>
         </w:sdtPr>
+        <w:sdtEndPr/>
         <w:sdtContent>
           <w:r>
             <w:rPr>
@@ -12000,6 +12108,7 @@
           <w:id w:val="1859395464"/>
           <w:citation/>
         </w:sdtPr>
+        <w:sdtEndPr/>
         <w:sdtContent>
           <w:r>
             <w:rPr>
@@ -12534,6 +12643,7 @@
           <w:id w:val="-1211186385"/>
           <w:citation/>
         </w:sdtPr>
+        <w:sdtEndPr/>
         <w:sdtContent>
           <w:r>
             <w:rPr>
@@ -12755,6 +12865,7 @@
           <w:id w:val="-182359063"/>
           <w:citation/>
         </w:sdtPr>
+        <w:sdtEndPr/>
         <w:sdtContent>
           <w:r>
             <w:rPr>
@@ -13424,6 +13535,7 @@
           <w:id w:val="1328010935"/>
           <w:citation/>
         </w:sdtPr>
+        <w:sdtEndPr/>
         <w:sdtContent>
           <w:r>
             <w:rPr>
@@ -13705,6 +13817,7 @@
           <w:id w:val="-744483927"/>
           <w:citation/>
         </w:sdtPr>
+        <w:sdtEndPr/>
         <w:sdtContent>
           <w:r>
             <w:rPr>
@@ -14202,6 +14315,7 @@
           <w:id w:val="571162948"/>
           <w:citation/>
         </w:sdtPr>
+        <w:sdtEndPr/>
         <w:sdtContent>
           <w:r>
             <w:rPr>
@@ -14347,6 +14461,7 @@
           <w:id w:val="1958668962"/>
           <w:citation/>
         </w:sdtPr>
+        <w:sdtEndPr/>
         <w:sdtContent>
           <w:r>
             <w:rPr>
@@ -14427,6 +14542,7 @@
           <w:id w:val="-1301382641"/>
           <w:citation/>
         </w:sdtPr>
+        <w:sdtEndPr/>
         <w:sdtContent>
           <w:r>
             <w:rPr>
@@ -14566,6 +14682,7 @@
           <w:id w:val="1300892027"/>
           <w:citation/>
         </w:sdtPr>
+        <w:sdtEndPr/>
         <w:sdtContent>
           <w:r>
             <w:rPr>
@@ -14627,6 +14744,7 @@
           <w:id w:val="-238953301"/>
           <w:citation/>
         </w:sdtPr>
+        <w:sdtEndPr/>
         <w:sdtContent>
           <w:r>
             <w:fldChar w:fldCharType="begin"/>
@@ -14771,6 +14889,7 @@
           <w:id w:val="848759651"/>
           <w:citation/>
         </w:sdtPr>
+        <w:sdtEndPr/>
         <w:sdtContent>
           <w:r>
             <w:rPr>
@@ -15154,6 +15273,7 @@
           <w:id w:val="424540746"/>
           <w:citation/>
         </w:sdtPr>
+        <w:sdtEndPr/>
         <w:sdtContent>
           <w:r>
             <w:fldChar w:fldCharType="begin"/>
@@ -15190,7 +15310,7 @@
       <w:pPr>
         <w:pStyle w:val="Heading1"/>
       </w:pPr>
-      <w:bookmarkStart w:id="6" w:name="_Toc207378968"/>
+      <w:bookmarkStart w:id="7" w:name="_Toc207378968"/>
       <w:r>
         <w:t>2</w:t>
       </w:r>
@@ -15200,17 +15320,17 @@
       <w:r>
         <w:t>Luân lý</w:t>
       </w:r>
-      <w:bookmarkEnd w:id="6"/>
+      <w:bookmarkEnd w:id="7"/>
     </w:p>
     <w:p>
       <w:pPr>
         <w:pStyle w:val="Heading2"/>
       </w:pPr>
-      <w:bookmarkStart w:id="7" w:name="_Toc207378969"/>
+      <w:bookmarkStart w:id="8" w:name="_Toc207378969"/>
       <w:r>
         <w:t>2.1. Luân lý</w:t>
       </w:r>
-      <w:bookmarkEnd w:id="7"/>
+      <w:bookmarkEnd w:id="8"/>
     </w:p>
     <w:p>
       <w:r>
@@ -15251,6 +15371,7 @@
           <w:id w:val="-231234198"/>
           <w:citation/>
         </w:sdtPr>
+        <w:sdtEndPr/>
         <w:sdtContent>
           <w:r>
             <w:rPr>
@@ -15410,6 +15531,7 @@
           <w:id w:val="278459445"/>
           <w:citation/>
         </w:sdtPr>
+        <w:sdtEndPr/>
         <w:sdtContent>
           <w:r>
             <w:rPr>
@@ -15664,6 +15786,7 @@
           <w:id w:val="1708910900"/>
           <w:citation/>
         </w:sdtPr>
+        <w:sdtEndPr/>
         <w:sdtContent>
           <w:r>
             <w:fldChar w:fldCharType="begin"/>
@@ -15705,6 +15828,7 @@
           <w:id w:val="-484082473"/>
           <w:citation/>
         </w:sdtPr>
+        <w:sdtEndPr/>
         <w:sdtContent>
           <w:r>
             <w:fldChar w:fldCharType="begin"/>
@@ -15863,6 +15987,7 @@
           <w:id w:val="-1534569526"/>
           <w:citation/>
         </w:sdtPr>
+        <w:sdtEndPr/>
         <w:sdtContent>
           <w:r>
             <w:rPr>
@@ -15988,6 +16113,7 @@
           <w:id w:val="-161626508"/>
           <w:citation/>
         </w:sdtPr>
+        <w:sdtEndPr/>
         <w:sdtContent>
           <w:r>
             <w:fldChar w:fldCharType="begin"/>
@@ -16148,6 +16274,7 @@
           <w:id w:val="645941775"/>
           <w:citation/>
         </w:sdtPr>
+        <w:sdtEndPr/>
         <w:sdtContent>
           <w:r>
             <w:fldChar w:fldCharType="begin"/>
@@ -16183,6 +16310,7 @@
           <w:id w:val="688715538"/>
           <w:citation/>
         </w:sdtPr>
+        <w:sdtEndPr/>
         <w:sdtContent>
           <w:r>
             <w:fldChar w:fldCharType="begin"/>
@@ -16281,6 +16409,7 @@
           <w:id w:val="-477459507"/>
           <w:citation/>
         </w:sdtPr>
+        <w:sdtEndPr/>
         <w:sdtContent>
           <w:r>
             <w:fldChar w:fldCharType="begin"/>
@@ -16480,6 +16609,7 @@
           <w:id w:val="1739048472"/>
           <w:citation/>
         </w:sdtPr>
+        <w:sdtEndPr/>
         <w:sdtContent>
           <w:r>
             <w:fldChar w:fldCharType="begin"/>
@@ -16509,6 +16639,7 @@
           <w:id w:val="188964869"/>
           <w:citation/>
         </w:sdtPr>
+        <w:sdtEndPr/>
         <w:sdtContent>
           <w:r>
             <w:fldChar w:fldCharType="begin"/>
@@ -16598,6 +16729,7 @@
           <w:id w:val="1618403828"/>
           <w:citation/>
         </w:sdtPr>
+        <w:sdtEndPr/>
         <w:sdtContent>
           <w:r>
             <w:fldChar w:fldCharType="begin"/>
@@ -16666,6 +16798,7 @@
           <w:id w:val="405113838"/>
           <w:citation/>
         </w:sdtPr>
+        <w:sdtEndPr/>
         <w:sdtContent>
           <w:r>
             <w:fldChar w:fldCharType="begin"/>
@@ -16724,6 +16857,7 @@
           <w:id w:val="280223975"/>
           <w:citation/>
         </w:sdtPr>
+        <w:sdtEndPr/>
         <w:sdtContent>
           <w:r>
             <w:fldChar w:fldCharType="begin"/>
@@ -16807,6 +16941,7 @@
           <w:id w:val="1703276571"/>
           <w:citation/>
         </w:sdtPr>
+        <w:sdtEndPr/>
         <w:sdtContent>
           <w:r>
             <w:fldChar w:fldCharType="begin"/>
@@ -16872,6 +17007,7 @@
           <w:id w:val="900641410"/>
           <w:citation/>
         </w:sdtPr>
+        <w:sdtEndPr/>
         <w:sdtContent>
           <w:r>
             <w:fldChar w:fldCharType="begin"/>
@@ -17105,6 +17241,7 @@
           <w:id w:val="-1767296031"/>
           <w:citation/>
         </w:sdtPr>
+        <w:sdtEndPr/>
         <w:sdtContent>
           <w:r>
             <w:fldChar w:fldCharType="begin"/>
@@ -17206,6 +17343,7 @@
           <w:id w:val="-1353104537"/>
           <w:citation/>
         </w:sdtPr>
+        <w:sdtEndPr/>
         <w:sdtContent>
           <w:r>
             <w:fldChar w:fldCharType="begin"/>
@@ -17348,6 +17486,7 @@
           <w:id w:val="673998254"/>
           <w:citation/>
         </w:sdtPr>
+        <w:sdtEndPr/>
         <w:sdtContent>
           <w:r>
             <w:fldChar w:fldCharType="begin"/>
@@ -17422,6 +17561,7 @@
           <w:id w:val="1889614178"/>
           <w:citation/>
         </w:sdtPr>
+        <w:sdtEndPr/>
         <w:sdtContent>
           <w:r>
             <w:fldChar w:fldCharType="begin"/>
@@ -17475,6 +17615,7 @@
           <w:id w:val="-656611459"/>
           <w:citation/>
         </w:sdtPr>
+        <w:sdtEndPr/>
         <w:sdtContent>
           <w:r>
             <w:fldChar w:fldCharType="begin"/>
@@ -17582,6 +17723,7 @@
           <w:id w:val="-502671285"/>
           <w:citation/>
         </w:sdtPr>
+        <w:sdtEndPr/>
         <w:sdtContent>
           <w:r>
             <w:fldChar w:fldCharType="begin"/>
@@ -17710,6 +17852,7 @@
           <w:id w:val="-290586245"/>
           <w:citation/>
         </w:sdtPr>
+        <w:sdtEndPr/>
         <w:sdtContent>
           <w:r>
             <w:fldChar w:fldCharType="begin"/>
@@ -17965,11 +18108,11 @@
       <w:pPr>
         <w:pStyle w:val="Heading2"/>
       </w:pPr>
-      <w:bookmarkStart w:id="8" w:name="_Toc207378970"/>
+      <w:bookmarkStart w:id="9" w:name="_Toc207378970"/>
       <w:r>
         <w:t>2.2. Trách nhiệm</w:t>
       </w:r>
-      <w:bookmarkEnd w:id="8"/>
+      <w:bookmarkEnd w:id="9"/>
     </w:p>
     <w:p>
       <w:r>
@@ -18035,6 +18178,7 @@
           <w:id w:val="290712286"/>
           <w:citation/>
         </w:sdtPr>
+        <w:sdtEndPr/>
         <w:sdtContent>
           <w:r>
             <w:fldChar w:fldCharType="begin"/>
@@ -18103,6 +18247,7 @@
           <w:id w:val="-2438876"/>
           <w:citation/>
         </w:sdtPr>
+        <w:sdtEndPr/>
         <w:sdtContent>
           <w:r>
             <w:fldChar w:fldCharType="begin"/>
@@ -18165,6 +18310,7 @@
           <w:id w:val="1534073850"/>
           <w:citation/>
         </w:sdtPr>
+        <w:sdtEndPr/>
         <w:sdtContent>
           <w:r>
             <w:fldChar w:fldCharType="begin"/>
@@ -18298,6 +18444,7 @@
           <w:id w:val="-315498531"/>
           <w:citation/>
         </w:sdtPr>
+        <w:sdtEndPr/>
         <w:sdtContent>
           <w:r>
             <w:fldChar w:fldCharType="begin"/>
@@ -18565,11 +18712,11 @@
       <w:pPr>
         <w:pStyle w:val="Heading2"/>
       </w:pPr>
-      <w:bookmarkStart w:id="9" w:name="_Toc207378971"/>
+      <w:bookmarkStart w:id="10" w:name="_Toc207378971"/>
       <w:r>
         <w:t>2.3. An lạc</w:t>
       </w:r>
-      <w:bookmarkEnd w:id="9"/>
+      <w:bookmarkEnd w:id="10"/>
     </w:p>
     <w:p>
       <w:r>
@@ -18616,6 +18763,7 @@
           <w:id w:val="1310986402"/>
           <w:citation/>
         </w:sdtPr>
+        <w:sdtEndPr/>
         <w:sdtContent>
           <w:r>
             <w:fldChar w:fldCharType="begin"/>
@@ -18768,6 +18916,7 @@
           <w:id w:val="-1108187935"/>
           <w:citation/>
         </w:sdtPr>
+        <w:sdtEndPr/>
         <w:sdtContent>
           <w:r>
             <w:fldChar w:fldCharType="begin"/>
@@ -18869,6 +19018,7 @@
           <w:id w:val="1350677275"/>
           <w:citation/>
         </w:sdtPr>
+        <w:sdtEndPr/>
         <w:sdtContent>
           <w:r>
             <w:fldChar w:fldCharType="begin"/>
@@ -18925,6 +19075,7 @@
           <w:id w:val="-1679650440"/>
           <w:citation/>
         </w:sdtPr>
+        <w:sdtEndPr/>
         <w:sdtContent>
           <w:r>
             <w:fldChar w:fldCharType="begin"/>
@@ -18966,6 +19117,7 @@
           <w:id w:val="1466775100"/>
           <w:citation/>
         </w:sdtPr>
+        <w:sdtEndPr/>
         <w:sdtContent>
           <w:r>
             <w:fldChar w:fldCharType="begin"/>
@@ -19037,6 +19189,7 @@
           <w:id w:val="1853140764"/>
           <w:citation/>
         </w:sdtPr>
+        <w:sdtEndPr/>
         <w:sdtContent>
           <w:r>
             <w:fldChar w:fldCharType="begin"/>
@@ -19156,6 +19309,7 @@
           <w:id w:val="-2106339788"/>
           <w:citation/>
         </w:sdtPr>
+        <w:sdtEndPr/>
         <w:sdtContent>
           <w:r>
             <w:fldChar w:fldCharType="begin"/>
@@ -19255,11 +19409,11 @@
       <w:pPr>
         <w:pStyle w:val="Heading2"/>
       </w:pPr>
-      <w:bookmarkStart w:id="10" w:name="_Toc207378972"/>
+      <w:bookmarkStart w:id="11" w:name="_Toc207378972"/>
       <w:r>
         <w:t>2.4. Cái thiện &amp; lương tâm</w:t>
       </w:r>
-      <w:bookmarkEnd w:id="10"/>
+      <w:bookmarkEnd w:id="11"/>
     </w:p>
     <w:p>
       <w:r>
@@ -19303,6 +19457,7 @@
           <w:id w:val="818458160"/>
           <w:citation/>
         </w:sdtPr>
+        <w:sdtEndPr/>
         <w:sdtContent>
           <w:r>
             <w:fldChar w:fldCharType="begin"/>
@@ -19404,6 +19559,7 @@
           <w:id w:val="1356622892"/>
           <w:citation/>
         </w:sdtPr>
+        <w:sdtEndPr/>
         <w:sdtContent>
           <w:r>
             <w:fldChar w:fldCharType="begin"/>
@@ -19548,6 +19704,7 @@
           <w:id w:val="-775096721"/>
           <w:citation/>
         </w:sdtPr>
+        <w:sdtEndPr/>
         <w:sdtContent>
           <w:r>
             <w:fldChar w:fldCharType="begin"/>
@@ -19607,6 +19764,7 @@
           <w:id w:val="1156651106"/>
           <w:citation/>
         </w:sdtPr>
+        <w:sdtEndPr/>
         <w:sdtContent>
           <w:r>
             <w:fldChar w:fldCharType="begin"/>
@@ -19678,6 +19836,7 @@
           <w:id w:val="-219669306"/>
           <w:citation/>
         </w:sdtPr>
+        <w:sdtEndPr/>
         <w:sdtContent>
           <w:r>
             <w:fldChar w:fldCharType="begin"/>
@@ -19719,6 +19878,7 @@
           <w:id w:val="-346711893"/>
           <w:citation/>
         </w:sdtPr>
+        <w:sdtEndPr/>
         <w:sdtContent>
           <w:r>
             <w:fldChar w:fldCharType="begin"/>
@@ -19793,6 +19953,7 @@
           <w:id w:val="-1502345271"/>
           <w:citation/>
         </w:sdtPr>
+        <w:sdtEndPr/>
         <w:sdtContent>
           <w:r>
             <w:fldChar w:fldCharType="begin"/>
@@ -19839,6 +20000,7 @@
           <w:id w:val="-432745503"/>
           <w:citation/>
         </w:sdtPr>
+        <w:sdtEndPr/>
         <w:sdtContent>
           <w:r>
             <w:fldChar w:fldCharType="begin"/>
@@ -19916,6 +20078,7 @@
           <w:id w:val="-564182858"/>
           <w:citation/>
         </w:sdtPr>
+        <w:sdtEndPr/>
         <w:sdtContent>
           <w:r>
             <w:fldChar w:fldCharType="begin"/>
@@ -19963,6 +20126,7 @@
           <w:id w:val="-1998652299"/>
           <w:citation/>
         </w:sdtPr>
+        <w:sdtEndPr/>
         <w:sdtContent>
           <w:r>
             <w:fldChar w:fldCharType="begin"/>
@@ -20016,6 +20180,7 @@
           <w:id w:val="-711885698"/>
           <w:citation/>
         </w:sdtPr>
+        <w:sdtEndPr/>
         <w:sdtContent>
           <w:r>
             <w:fldChar w:fldCharType="begin"/>
@@ -20081,6 +20246,7 @@
           <w:id w:val="1505394883"/>
           <w:citation/>
         </w:sdtPr>
+        <w:sdtEndPr/>
         <w:sdtContent>
           <w:r>
             <w:fldChar w:fldCharType="begin"/>
@@ -20125,6 +20291,7 @@
           <w:id w:val="1405185176"/>
           <w:citation/>
         </w:sdtPr>
+        <w:sdtEndPr/>
         <w:sdtContent>
           <w:r>
             <w:fldChar w:fldCharType="begin"/>
@@ -20307,6 +20474,7 @@
           <w:id w:val="-1356953800"/>
           <w:citation/>
         </w:sdtPr>
+        <w:sdtEndPr/>
         <w:sdtContent>
           <w:r>
             <w:fldChar w:fldCharType="begin"/>
@@ -20342,6 +20510,7 @@
           <w:id w:val="-1952004997"/>
           <w:citation/>
         </w:sdtPr>
+        <w:sdtEndPr/>
         <w:sdtContent>
           <w:r>
             <w:fldChar w:fldCharType="begin"/>
@@ -20425,6 +20594,7 @@
           <w:id w:val="885683548"/>
           <w:citation/>
         </w:sdtPr>
+        <w:sdtEndPr/>
         <w:sdtContent>
           <w:r>
             <w:fldChar w:fldCharType="begin"/>
@@ -20475,6 +20645,7 @@
           <w:id w:val="534545790"/>
           <w:citation/>
         </w:sdtPr>
+        <w:sdtEndPr/>
         <w:sdtContent>
           <w:r>
             <w:fldChar w:fldCharType="begin"/>
@@ -20510,6 +20681,7 @@
           <w:id w:val="2071911806"/>
           <w:citation/>
         </w:sdtPr>
+        <w:sdtEndPr/>
         <w:sdtContent>
           <w:r>
             <w:fldChar w:fldCharType="begin"/>
@@ -20586,6 +20758,7 @@
           <w:id w:val="1073240275"/>
           <w:citation/>
         </w:sdtPr>
+        <w:sdtEndPr/>
         <w:sdtContent>
           <w:r>
             <w:fldChar w:fldCharType="begin"/>
@@ -20834,6 +21007,7 @@
           <w:id w:val="-1189366295"/>
           <w:citation/>
         </w:sdtPr>
+        <w:sdtEndPr/>
         <w:sdtContent>
           <w:r>
             <w:fldChar w:fldCharType="begin"/>
@@ -21040,6 +21214,7 @@
           <w:id w:val="1887286205"/>
           <w:citation/>
         </w:sdtPr>
+        <w:sdtEndPr/>
         <w:sdtContent>
           <w:r>
             <w:fldChar w:fldCharType="begin"/>
@@ -21084,6 +21259,7 @@
           <w:id w:val="-1771777461"/>
           <w:citation/>
         </w:sdtPr>
+        <w:sdtEndPr/>
         <w:sdtContent>
           <w:r>
             <w:fldChar w:fldCharType="begin"/>
@@ -21224,6 +21400,7 @@
           <w:id w:val="759950769"/>
           <w:citation/>
         </w:sdtPr>
+        <w:sdtEndPr/>
         <w:sdtContent>
           <w:r>
             <w:fldChar w:fldCharType="begin"/>
@@ -21532,6 +21709,7 @@
           <w:id w:val="945272685"/>
           <w:citation/>
         </w:sdtPr>
+        <w:sdtEndPr/>
         <w:sdtContent>
           <w:r>
             <w:fldChar w:fldCharType="begin"/>
@@ -21564,6 +21742,7 @@
           <w:id w:val="1302651968"/>
           <w:citation/>
         </w:sdtPr>
+        <w:sdtEndPr/>
         <w:sdtContent>
           <w:r>
             <w:fldChar w:fldCharType="begin"/>
@@ -21704,6 +21883,7 @@
           <w:id w:val="531227778"/>
           <w:citation/>
         </w:sdtPr>
+        <w:sdtEndPr/>
         <w:sdtContent>
           <w:r>
             <w:fldChar w:fldCharType="begin"/>
@@ -22171,6 +22351,7 @@
           <w:id w:val="-1751110580"/>
           <w:citation/>
         </w:sdtPr>
+        <w:sdtEndPr/>
         <w:sdtContent>
           <w:r>
             <w:fldChar w:fldCharType="begin"/>
@@ -22391,6 +22572,7 @@
           <w:id w:val="-1856963498"/>
           <w:citation/>
         </w:sdtPr>
+        <w:sdtEndPr/>
         <w:sdtContent>
           <w:r>
             <w:fldChar w:fldCharType="begin"/>
@@ -22541,6 +22723,7 @@
           <w:id w:val="1724943081"/>
           <w:citation/>
         </w:sdtPr>
+        <w:sdtEndPr/>
         <w:sdtContent>
           <w:r>
             <w:fldChar w:fldCharType="begin"/>
@@ -22579,6 +22762,7 @@
           <w:id w:val="-1904977449"/>
           <w:citation/>
         </w:sdtPr>
+        <w:sdtEndPr/>
         <w:sdtContent>
           <w:r>
             <w:fldChar w:fldCharType="begin"/>
@@ -22616,6 +22800,7 @@
           <w:id w:val="1650316822"/>
           <w:citation/>
         </w:sdtPr>
+        <w:sdtEndPr/>
         <w:sdtContent>
           <w:r>
             <w:fldChar w:fldCharType="begin"/>
@@ -22720,6 +22905,7 @@
           <w:id w:val="-12536058"/>
           <w:citation/>
         </w:sdtPr>
+        <w:sdtEndPr/>
         <w:sdtContent>
           <w:r>
             <w:fldChar w:fldCharType="begin"/>
@@ -22779,6 +22965,7 @@
           <w:id w:val="665291327"/>
           <w:citation/>
         </w:sdtPr>
+        <w:sdtEndPr/>
         <w:sdtContent>
           <w:r>
             <w:fldChar w:fldCharType="begin"/>
@@ -22808,6 +22995,7 @@
           <w:id w:val="2061898356"/>
           <w:citation/>
         </w:sdtPr>
+        <w:sdtEndPr/>
         <w:sdtContent>
           <w:r>
             <w:fldChar w:fldCharType="begin"/>
@@ -22965,6 +23153,7 @@
           <w:id w:val="-117293621"/>
           <w:citation/>
         </w:sdtPr>
+        <w:sdtEndPr/>
         <w:sdtContent>
           <w:r>
             <w:fldChar w:fldCharType="begin"/>
@@ -23030,6 +23219,7 @@
           <w:id w:val="-1552601384"/>
           <w:citation/>
         </w:sdtPr>
+        <w:sdtEndPr/>
         <w:sdtContent>
           <w:r>
             <w:fldChar w:fldCharType="begin"/>
@@ -23141,6 +23331,7 @@
           <w:id w:val="934412890"/>
           <w:citation/>
         </w:sdtPr>
+        <w:sdtEndPr/>
         <w:sdtContent>
           <w:r>
             <w:fldChar w:fldCharType="begin"/>
@@ -23203,6 +23394,7 @@
           <w:id w:val="-381407425"/>
           <w:citation/>
         </w:sdtPr>
+        <w:sdtEndPr/>
         <w:sdtContent>
           <w:r>
             <w:fldChar w:fldCharType="begin"/>
@@ -23327,6 +23519,7 @@
           <w:id w:val="1265121844"/>
           <w:citation/>
         </w:sdtPr>
+        <w:sdtEndPr/>
         <w:sdtContent>
           <w:r>
             <w:fldChar w:fldCharType="begin"/>
@@ -23435,7 +23628,7 @@
       <w:pPr>
         <w:pStyle w:val="Heading1"/>
       </w:pPr>
-      <w:bookmarkStart w:id="11" w:name="_Toc207378973"/>
+      <w:bookmarkStart w:id="12" w:name="_Toc207378973"/>
       <w:r>
         <w:lastRenderedPageBreak/>
         <w:t>3</w:t>
@@ -23443,17 +23636,17 @@
       <w:r>
         <w:t>. Đạo đức</w:t>
       </w:r>
-      <w:bookmarkEnd w:id="11"/>
+      <w:bookmarkEnd w:id="12"/>
     </w:p>
     <w:p>
       <w:pPr>
         <w:pStyle w:val="Heading2"/>
       </w:pPr>
-      <w:bookmarkStart w:id="12" w:name="_Toc207378974"/>
+      <w:bookmarkStart w:id="13" w:name="_Toc207378974"/>
       <w:r>
         <w:t>3.1. Đời sống đạo đức</w:t>
       </w:r>
-      <w:bookmarkEnd w:id="12"/>
+      <w:bookmarkEnd w:id="13"/>
     </w:p>
     <w:p>
       <w:r>
@@ -23473,6 +23666,7 @@
           <w:id w:val="1121189533"/>
           <w:citation/>
         </w:sdtPr>
+        <w:sdtEndPr/>
         <w:sdtContent>
           <w:r>
             <w:fldChar w:fldCharType="begin"/>
@@ -23511,6 +23705,7 @@
           <w:id w:val="1843505356"/>
           <w:citation/>
         </w:sdtPr>
+        <w:sdtEndPr/>
         <w:sdtContent>
           <w:r>
             <w:fldChar w:fldCharType="begin"/>
@@ -23558,6 +23753,7 @@
           <w:id w:val="-967668300"/>
           <w:citation/>
         </w:sdtPr>
+        <w:sdtEndPr/>
         <w:sdtContent>
           <w:r>
             <w:fldChar w:fldCharType="begin"/>
@@ -23626,6 +23822,7 @@
           <w:id w:val="2095126139"/>
           <w:citation/>
         </w:sdtPr>
+        <w:sdtEndPr/>
         <w:sdtContent>
           <w:r>
             <w:fldChar w:fldCharType="begin"/>
@@ -23708,6 +23905,7 @@
           <w:id w:val="-1413237753"/>
           <w:citation/>
         </w:sdtPr>
+        <w:sdtEndPr/>
         <w:sdtContent>
           <w:r>
             <w:fldChar w:fldCharType="begin"/>
@@ -23773,6 +23971,7 @@
           <w:id w:val="-530491132"/>
           <w:citation/>
         </w:sdtPr>
+        <w:sdtEndPr/>
         <w:sdtContent>
           <w:r>
             <w:rPr>
@@ -23832,6 +24031,7 @@
           <w:id w:val="412593393"/>
           <w:citation/>
         </w:sdtPr>
+        <w:sdtEndPr/>
         <w:sdtContent>
           <w:r>
             <w:fldChar w:fldCharType="begin"/>
@@ -23887,6 +24087,7 @@
           <w:id w:val="579179358"/>
           <w:citation/>
         </w:sdtPr>
+        <w:sdtEndPr/>
         <w:sdtContent>
           <w:r>
             <w:fldChar w:fldCharType="begin"/>
@@ -23922,6 +24123,7 @@
           <w:id w:val="-490877941"/>
           <w:citation/>
         </w:sdtPr>
+        <w:sdtEndPr/>
         <w:sdtContent>
           <w:r>
             <w:fldChar w:fldCharType="begin"/>
@@ -23979,6 +24181,7 @@
           <w:id w:val="-545142340"/>
           <w:citation/>
         </w:sdtPr>
+        <w:sdtEndPr/>
         <w:sdtContent>
           <w:r>
             <w:fldChar w:fldCharType="begin"/>
@@ -24020,6 +24223,7 @@
           <w:id w:val="-923107562"/>
           <w:citation/>
         </w:sdtPr>
+        <w:sdtEndPr/>
         <w:sdtContent>
           <w:r>
             <w:rPr>
@@ -24058,6 +24262,7 @@
           <w:id w:val="-720522402"/>
           <w:citation/>
         </w:sdtPr>
+        <w:sdtEndPr/>
         <w:sdtContent>
           <w:r>
             <w:fldChar w:fldCharType="begin"/>
@@ -24508,6 +24713,7 @@
           <w:id w:val="-1952232205"/>
           <w:citation/>
         </w:sdtPr>
+        <w:sdtEndPr/>
         <w:sdtContent>
           <w:r>
             <w:fldChar w:fldCharType="begin"/>
@@ -24744,6 +24950,7 @@
           <w:id w:val="621264491"/>
           <w:citation/>
         </w:sdtPr>
+        <w:sdtEndPr/>
         <w:sdtContent>
           <w:r>
             <w:fldChar w:fldCharType="begin"/>
@@ -25060,6 +25267,7 @@
           <w:id w:val="-523637735"/>
           <w:citation/>
         </w:sdtPr>
+        <w:sdtEndPr/>
         <w:sdtContent>
           <w:r>
             <w:fldChar w:fldCharType="begin"/>
@@ -25159,6 +25367,7 @@
           <w:id w:val="-901678289"/>
           <w:citation/>
         </w:sdtPr>
+        <w:sdtEndPr/>
         <w:sdtContent>
           <w:r>
             <w:fldChar w:fldCharType="begin"/>
@@ -25317,6 +25526,7 @@
           <w:id w:val="-1191366800"/>
           <w:citation/>
         </w:sdtPr>
+        <w:sdtEndPr/>
         <w:sdtContent>
           <w:r>
             <w:fldChar w:fldCharType="begin"/>
@@ -25352,6 +25562,7 @@
           <w:id w:val="-1837217179"/>
           <w:citation/>
         </w:sdtPr>
+        <w:sdtEndPr/>
         <w:sdtContent>
           <w:r>
             <w:fldChar w:fldCharType="begin"/>
@@ -25554,6 +25765,7 @@
           <w:id w:val="-632479530"/>
           <w:citation/>
         </w:sdtPr>
+        <w:sdtEndPr/>
         <w:sdtContent>
           <w:r>
             <w:fldChar w:fldCharType="begin"/>
@@ -25595,6 +25807,7 @@
           <w:id w:val="-2135857528"/>
           <w:citation/>
         </w:sdtPr>
+        <w:sdtEndPr/>
         <w:sdtContent>
           <w:r>
             <w:rPr>
@@ -25679,6 +25892,7 @@
           <w:id w:val="-1956089413"/>
           <w:citation/>
         </w:sdtPr>
+        <w:sdtEndPr/>
         <w:sdtContent>
           <w:r>
             <w:fldChar w:fldCharType="begin"/>
@@ -26172,6 +26386,7 @@
           <w:id w:val="-812946070"/>
           <w:citation/>
         </w:sdtPr>
+        <w:sdtEndPr/>
         <w:sdtContent>
           <w:r>
             <w:fldChar w:fldCharType="begin"/>
@@ -26276,6 +26491,7 @@
           <w:id w:val="795491966"/>
           <w:citation/>
         </w:sdtPr>
+        <w:sdtEndPr/>
         <w:sdtContent>
           <w:r>
             <w:fldChar w:fldCharType="begin"/>
@@ -26329,6 +26545,7 @@
           <w:id w:val="519521007"/>
           <w:citation/>
         </w:sdtPr>
+        <w:sdtEndPr/>
         <w:sdtContent>
           <w:r>
             <w:fldChar w:fldCharType="begin"/>
@@ -26382,6 +26599,7 @@
           <w:id w:val="1608155538"/>
           <w:citation/>
         </w:sdtPr>
+        <w:sdtEndPr/>
         <w:sdtContent>
           <w:r>
             <w:fldChar w:fldCharType="begin"/>
@@ -26450,6 +26668,7 @@
           <w:id w:val="-1443143617"/>
           <w:citation/>
         </w:sdtPr>
+        <w:sdtEndPr/>
         <w:sdtContent>
           <w:r>
             <w:fldChar w:fldCharType="begin"/>
@@ -26497,6 +26716,7 @@
           <w:id w:val="-532799822"/>
           <w:citation/>
         </w:sdtPr>
+        <w:sdtEndPr/>
         <w:sdtContent>
           <w:r>
             <w:fldChar w:fldCharType="begin"/>
@@ -26542,6 +26762,7 @@
           <w:id w:val="575707864"/>
           <w:citation/>
         </w:sdtPr>
+        <w:sdtEndPr/>
         <w:sdtContent>
           <w:r>
             <w:fldChar w:fldCharType="begin"/>
@@ -26693,6 +26914,7 @@
           <w:id w:val="93515361"/>
           <w:citation/>
         </w:sdtPr>
+        <w:sdtEndPr/>
         <w:sdtContent>
           <w:r>
             <w:fldChar w:fldCharType="begin"/>
@@ -26728,6 +26950,7 @@
           <w:id w:val="2051036133"/>
           <w:citation/>
         </w:sdtPr>
+        <w:sdtEndPr/>
         <w:sdtContent>
           <w:r>
             <w:fldChar w:fldCharType="begin"/>
@@ -26776,7 +26999,7 @@
       <w:pPr>
         <w:pStyle w:val="Heading2"/>
       </w:pPr>
-      <w:bookmarkStart w:id="13" w:name="_Toc207378975"/>
+      <w:bookmarkStart w:id="14" w:name="_Toc207378975"/>
       <w:r>
         <w:t>3.</w:t>
       </w:r>
@@ -26789,7 +27012,7 @@
       <w:r>
         <w:t>Gia đình</w:t>
       </w:r>
-      <w:bookmarkEnd w:id="13"/>
+      <w:bookmarkEnd w:id="14"/>
     </w:p>
     <w:p>
       <w:r>
@@ -26869,6 +27092,7 @@
           <w:id w:val="1159578071"/>
           <w:citation/>
         </w:sdtPr>
+        <w:sdtEndPr/>
         <w:sdtContent>
           <w:r>
             <w:fldChar w:fldCharType="begin"/>
@@ -26982,6 +27206,7 @@
           <w:id w:val="-369378469"/>
           <w:citation/>
         </w:sdtPr>
+        <w:sdtEndPr/>
         <w:sdtContent>
           <w:r>
             <w:fldChar w:fldCharType="begin"/>
@@ -27239,6 +27464,7 @@
           <w:id w:val="1817073650"/>
           <w:citation/>
         </w:sdtPr>
+        <w:sdtEndPr/>
         <w:sdtContent>
           <w:r>
             <w:fldChar w:fldCharType="begin"/>
@@ -27340,6 +27566,7 @@
           <w:id w:val="1115493782"/>
           <w:citation/>
         </w:sdtPr>
+        <w:sdtEndPr/>
         <w:sdtContent>
           <w:r>
             <w:fldChar w:fldCharType="begin"/>
@@ -27429,6 +27656,7 @@
           <w:id w:val="1754938094"/>
           <w:citation/>
         </w:sdtPr>
+        <w:sdtEndPr/>
         <w:sdtContent>
           <w:r>
             <w:rPr>
@@ -27515,6 +27743,7 @@
           <w:id w:val="-129868606"/>
           <w:citation/>
         </w:sdtPr>
+        <w:sdtEndPr/>
         <w:sdtContent>
           <w:r>
             <w:fldChar w:fldCharType="begin"/>
@@ -27679,6 +27908,7 @@
           <w:id w:val="-285822015"/>
           <w:citation/>
         </w:sdtPr>
+        <w:sdtEndPr/>
         <w:sdtContent>
           <w:r>
             <w:fldChar w:fldCharType="begin"/>
@@ -27726,6 +27956,7 @@
           <w:id w:val="-1765987934"/>
           <w:citation/>
         </w:sdtPr>
+        <w:sdtEndPr/>
         <w:sdtContent>
           <w:r>
             <w:fldChar w:fldCharType="begin"/>
@@ -27884,6 +28115,7 @@
           <w:id w:val="142634692"/>
           <w:citation/>
         </w:sdtPr>
+        <w:sdtEndPr/>
         <w:sdtContent>
           <w:r>
             <w:rPr>
@@ -28158,6 +28390,7 @@
           <w:id w:val="1093121911"/>
           <w:citation/>
         </w:sdtPr>
+        <w:sdtEndPr/>
         <w:sdtContent>
           <w:r>
             <w:fldChar w:fldCharType="begin"/>
@@ -28190,6 +28423,7 @@
           <w:id w:val="2005402558"/>
           <w:citation/>
         </w:sdtPr>
+        <w:sdtEndPr/>
         <w:sdtContent>
           <w:r>
             <w:fldChar w:fldCharType="begin"/>
@@ -28273,6 +28507,7 @@
           <w:id w:val="-1879926205"/>
           <w:citation/>
         </w:sdtPr>
+        <w:sdtEndPr/>
         <w:sdtContent>
           <w:r>
             <w:fldChar w:fldCharType="begin"/>
@@ -28458,6 +28693,7 @@
           <w:id w:val="226729707"/>
           <w:citation/>
         </w:sdtPr>
+        <w:sdtEndPr/>
         <w:sdtContent>
           <w:r>
             <w:fldChar w:fldCharType="begin"/>
@@ -28511,6 +28747,7 @@
           <w:id w:val="-1839075010"/>
           <w:citation/>
         </w:sdtPr>
+        <w:sdtEndPr/>
         <w:sdtContent>
           <w:r>
             <w:fldChar w:fldCharType="begin"/>
@@ -28663,6 +28900,7 @@
           <w:id w:val="-1232541465"/>
           <w:citation/>
         </w:sdtPr>
+        <w:sdtEndPr/>
         <w:sdtContent>
           <w:r>
             <w:fldChar w:fldCharType="begin"/>
@@ -28716,6 +28954,7 @@
           <w:id w:val="1407730236"/>
           <w:citation/>
         </w:sdtPr>
+        <w:sdtEndPr/>
         <w:sdtContent>
           <w:r>
             <w:fldChar w:fldCharType="begin"/>
@@ -28813,6 +29052,7 @@
           <w:id w:val="1304046663"/>
           <w:citation/>
         </w:sdtPr>
+        <w:sdtEndPr/>
         <w:sdtContent>
           <w:r>
             <w:fldChar w:fldCharType="begin"/>
@@ -28863,6 +29103,7 @@
           <w:id w:val="-22641778"/>
           <w:citation/>
         </w:sdtPr>
+        <w:sdtEndPr/>
         <w:sdtContent>
           <w:r>
             <w:fldChar w:fldCharType="begin"/>
@@ -28907,6 +29148,7 @@
           <w:id w:val="1768818239"/>
           <w:citation/>
         </w:sdtPr>
+        <w:sdtEndPr/>
         <w:sdtContent>
           <w:r>
             <w:fldChar w:fldCharType="begin"/>
@@ -28939,6 +29181,7 @@
           <w:id w:val="-844174466"/>
           <w:citation/>
         </w:sdtPr>
+        <w:sdtEndPr/>
         <w:sdtContent>
           <w:r>
             <w:fldChar w:fldCharType="begin"/>
@@ -29204,6 +29447,7 @@
           <w:id w:val="1021056701"/>
           <w:citation/>
         </w:sdtPr>
+        <w:sdtEndPr/>
         <w:sdtContent>
           <w:r>
             <w:fldChar w:fldCharType="begin"/>
@@ -29236,6 +29480,7 @@
           <w:id w:val="-60639499"/>
           <w:citation/>
         </w:sdtPr>
+        <w:sdtEndPr/>
         <w:sdtContent>
           <w:r>
             <w:fldChar w:fldCharType="begin"/>
@@ -29274,6 +29519,7 @@
           <w:id w:val="-400749997"/>
           <w:citation/>
         </w:sdtPr>
+        <w:sdtEndPr/>
         <w:sdtContent>
           <w:r>
             <w:fldChar w:fldCharType="begin"/>
@@ -29306,6 +29552,7 @@
           <w:id w:val="1561977136"/>
           <w:citation/>
         </w:sdtPr>
+        <w:sdtEndPr/>
         <w:sdtContent>
           <w:r>
             <w:fldChar w:fldCharType="begin"/>
@@ -29350,6 +29597,7 @@
           <w:id w:val="-1847392837"/>
           <w:citation/>
         </w:sdtPr>
+        <w:sdtEndPr/>
         <w:sdtContent>
           <w:r>
             <w:fldChar w:fldCharType="begin"/>
@@ -29394,6 +29642,7 @@
           <w:id w:val="-1706396919"/>
           <w:citation/>
         </w:sdtPr>
+        <w:sdtEndPr/>
         <w:sdtContent>
           <w:r>
             <w:fldChar w:fldCharType="begin"/>
@@ -29424,11 +29673,11 @@
       <w:pPr>
         <w:pStyle w:val="Heading1"/>
       </w:pPr>
-      <w:bookmarkStart w:id="14" w:name="_Toc207378976"/>
+      <w:bookmarkStart w:id="15" w:name="_Toc207378976"/>
       <w:r>
         <w:t>4. Xã hội dân sự</w:t>
       </w:r>
-      <w:bookmarkEnd w:id="14"/>
+      <w:bookmarkEnd w:id="15"/>
     </w:p>
     <w:p>
       <w:r>
@@ -29560,6 +29809,7 @@
           <w:id w:val="48893620"/>
           <w:citation/>
         </w:sdtPr>
+        <w:sdtEndPr/>
         <w:sdtContent>
           <w:r>
             <w:fldChar w:fldCharType="begin"/>
@@ -29700,6 +29950,7 @@
           <w:id w:val="1181626270"/>
           <w:citation/>
         </w:sdtPr>
+        <w:sdtEndPr/>
         <w:sdtContent>
           <w:r>
             <w:fldChar w:fldCharType="begin"/>
@@ -29732,6 +29983,7 @@
           <w:id w:val="1995835362"/>
           <w:citation/>
         </w:sdtPr>
+        <w:sdtEndPr/>
         <w:sdtContent>
           <w:r>
             <w:fldChar w:fldCharType="begin"/>
@@ -29881,6 +30133,7 @@
           <w:id w:val="-892963274"/>
           <w:citation/>
         </w:sdtPr>
+        <w:sdtEndPr/>
         <w:sdtContent>
           <w:r>
             <w:fldChar w:fldCharType="begin"/>
@@ -30186,6 +30439,7 @@
           <w:id w:val="531773301"/>
           <w:citation/>
         </w:sdtPr>
+        <w:sdtEndPr/>
         <w:sdtContent>
           <w:r>
             <w:fldChar w:fldCharType="begin"/>
@@ -30284,6 +30538,7 @@
           <w:id w:val="-1500109924"/>
           <w:citation/>
         </w:sdtPr>
+        <w:sdtEndPr/>
         <w:sdtContent>
           <w:r>
             <w:fldChar w:fldCharType="begin"/>
@@ -30322,6 +30577,7 @@
           <w:id w:val="1691261445"/>
           <w:citation/>
         </w:sdtPr>
+        <w:sdtEndPr/>
         <w:sdtContent>
           <w:r>
             <w:fldChar w:fldCharType="begin"/>
@@ -30414,6 +30670,7 @@
           <w:id w:val="1296867353"/>
           <w:citation/>
         </w:sdtPr>
+        <w:sdtEndPr/>
         <w:sdtContent>
           <w:r>
             <w:fldChar w:fldCharType="begin"/>
@@ -30449,6 +30706,7 @@
           <w:id w:val="-397215717"/>
           <w:citation/>
         </w:sdtPr>
+        <w:sdtEndPr/>
         <w:sdtContent>
           <w:r>
             <w:fldChar w:fldCharType="begin"/>
@@ -30509,6 +30767,7 @@
           <w:id w:val="-1665237753"/>
           <w:citation/>
         </w:sdtPr>
+        <w:sdtEndPr/>
         <w:sdtContent>
           <w:r>
             <w:fldChar w:fldCharType="begin"/>
@@ -30624,6 +30883,7 @@
           <w:id w:val="1318150583"/>
           <w:citation/>
         </w:sdtPr>
+        <w:sdtEndPr/>
         <w:sdtContent>
           <w:r>
             <w:fldChar w:fldCharType="begin"/>
@@ -30887,6 +31147,7 @@
           <w:id w:val="2035156152"/>
           <w:citation/>
         </w:sdtPr>
+        <w:sdtEndPr/>
         <w:sdtContent>
           <w:r>
             <w:fldChar w:fldCharType="begin"/>
@@ -30946,6 +31207,7 @@
           <w:id w:val="444209199"/>
           <w:citation/>
         </w:sdtPr>
+        <w:sdtEndPr/>
         <w:sdtContent>
           <w:r>
             <w:fldChar w:fldCharType="begin"/>
@@ -31008,6 +31270,7 @@
           <w:id w:val="519671017"/>
           <w:citation/>
         </w:sdtPr>
+        <w:sdtEndPr/>
         <w:sdtContent>
           <w:r>
             <w:fldChar w:fldCharType="begin"/>
@@ -31046,6 +31309,7 @@
           <w:id w:val="-179425927"/>
           <w:citation/>
         </w:sdtPr>
+        <w:sdtEndPr/>
         <w:sdtContent>
           <w:r>
             <w:fldChar w:fldCharType="begin"/>
@@ -31179,6 +31443,7 @@
           <w:id w:val="1959829485"/>
           <w:citation/>
         </w:sdtPr>
+        <w:sdtEndPr/>
         <w:sdtContent>
           <w:r>
             <w:fldChar w:fldCharType="begin"/>
@@ -31717,7 +31982,7 @@
       <w:pPr>
         <w:pStyle w:val="Heading2"/>
       </w:pPr>
-      <w:bookmarkStart w:id="15" w:name="_Toc207378977"/>
+      <w:bookmarkStart w:id="16" w:name="_Toc207378977"/>
       <w:r>
         <w:t>4</w:t>
       </w:r>
@@ -31733,7 +31998,7 @@
       <w:r>
         <w:t>Hệ thống những nhu cầu</w:t>
       </w:r>
-      <w:bookmarkEnd w:id="15"/>
+      <w:bookmarkEnd w:id="16"/>
     </w:p>
     <w:p>
       <w:r>
@@ -31831,6 +32096,7 @@
           <w:id w:val="78344242"/>
           <w:citation/>
         </w:sdtPr>
+        <w:sdtEndPr/>
         <w:sdtContent>
           <w:r>
             <w:fldChar w:fldCharType="begin"/>
@@ -32146,6 +32412,7 @@
           <w:id w:val="163915542"/>
           <w:citation/>
         </w:sdtPr>
+        <w:sdtEndPr/>
         <w:sdtContent>
           <w:r>
             <w:fldChar w:fldCharType="begin"/>
@@ -32205,6 +32472,7 @@
           <w:id w:val="1166205167"/>
           <w:citation/>
         </w:sdtPr>
+        <w:sdtEndPr/>
         <w:sdtContent>
           <w:r>
             <w:fldChar w:fldCharType="begin"/>
@@ -32258,6 +32526,7 @@
           <w:id w:val="-699091296"/>
           <w:citation/>
         </w:sdtPr>
+        <w:sdtEndPr/>
         <w:sdtContent>
           <w:r>
             <w:fldChar w:fldCharType="begin"/>
@@ -32406,6 +32675,7 @@
           <w:id w:val="1627277634"/>
           <w:citation/>
         </w:sdtPr>
+        <w:sdtEndPr/>
         <w:sdtContent>
           <w:r>
             <w:fldChar w:fldCharType="begin"/>
@@ -32498,6 +32768,7 @@
           <w:id w:val="1024980516"/>
           <w:citation/>
         </w:sdtPr>
+        <w:sdtEndPr/>
         <w:sdtContent>
           <w:r>
             <w:fldChar w:fldCharType="begin"/>
@@ -32536,6 +32807,7 @@
           <w:id w:val="236600930"/>
           <w:citation/>
         </w:sdtPr>
+        <w:sdtEndPr/>
         <w:sdtContent>
           <w:r>
             <w:fldChar w:fldCharType="begin"/>
@@ -32601,6 +32873,7 @@
           <w:id w:val="-446540789"/>
           <w:citation/>
         </w:sdtPr>
+        <w:sdtEndPr/>
         <w:sdtContent>
           <w:r>
             <w:fldChar w:fldCharType="begin"/>
@@ -32669,6 +32942,7 @@
           <w:id w:val="-1318724525"/>
           <w:citation/>
         </w:sdtPr>
+        <w:sdtEndPr/>
         <w:sdtContent>
           <w:r>
             <w:rPr>
@@ -32827,6 +33101,7 @@
           <w:id w:val="557209956"/>
           <w:citation/>
         </w:sdtPr>
+        <w:sdtEndPr/>
         <w:sdtContent>
           <w:r>
             <w:fldChar w:fldCharType="begin"/>
@@ -32895,6 +33170,7 @@
           <w:id w:val="-52169571"/>
           <w:citation/>
         </w:sdtPr>
+        <w:sdtEndPr/>
         <w:sdtContent>
           <w:r>
             <w:fldChar w:fldCharType="begin"/>
@@ -32939,6 +33215,7 @@
           <w:id w:val="-1231537029"/>
           <w:citation/>
         </w:sdtPr>
+        <w:sdtEndPr/>
         <w:sdtContent>
           <w:r>
             <w:fldChar w:fldCharType="begin"/>
@@ -32986,6 +33263,7 @@
           <w:id w:val="503633742"/>
           <w:citation/>
         </w:sdtPr>
+        <w:sdtEndPr/>
         <w:sdtContent>
           <w:r>
             <w:fldChar w:fldCharType="begin"/>
@@ -33027,6 +33305,7 @@
           <w:id w:val="2107684817"/>
           <w:citation/>
         </w:sdtPr>
+        <w:sdtEndPr/>
         <w:sdtContent>
           <w:r>
             <w:fldChar w:fldCharType="begin"/>
@@ -33236,6 +33515,7 @@
           <w:id w:val="-929432507"/>
           <w:citation/>
         </w:sdtPr>
+        <w:sdtEndPr/>
         <w:sdtContent>
           <w:r>
             <w:fldChar w:fldCharType="begin"/>
@@ -33258,27 +33538,16 @@
         </w:sdtContent>
       </w:sdt>
       <w:r>
-        <w:t xml:space="preserve"> </w:t>
-      </w:r>
-      <w:r>
-        <w:t>“</w:t>
+        <w:t xml:space="preserve"> “</w:t>
       </w:r>
       <w:r>
         <w:t>lợi nhuận phải được thay thế bằng một giá trị như tiện ích có thể là hàng hóa, thu nhập hoặc sự nghỉ ngơi, sự thỏa mãn, thú vui</w:t>
       </w:r>
       <w:r>
-        <w:t>” trong bài nghiên cứu “Sự cáo chung của lịch sử? (The End of History?)” bàn về chủ nghĩa tự do.</w:t>
-      </w:r>
-      <w:r>
-        <w:t xml:space="preserve"> </w:t>
-      </w:r>
-      <w:proofErr w:type="gramStart"/>
-      <w:r>
-        <w:t>Với</w:t>
-      </w:r>
-      <w:proofErr w:type="gramEnd"/>
-      <w:r>
-        <w:t xml:space="preserve"> của cải &amp; dịch vụ, n</w:t>
+        <w:t xml:space="preserve">” trong bài nghiên cứu “Sự cáo chung của lịch sử? (The End of History?)” bàn về chủ nghĩa tự do. </w:t>
+      </w:r>
+      <w:r>
+        <w:t>Với của cải &amp; dịch vụ, n</w:t>
       </w:r>
       <w:r>
         <w:t xml:space="preserve">ếu lượng giá bởi sự thỏa mãn khác biệt lượng giá bởi lượng lao động thì phải điều chỉnh lượng giá bởi lượng lao động về tương ứng với lượng giá bởi sự thỏa mãn vì một nguyên tắc rằng sản phẩm cuối cùng của nền kinh tế là sự thỏa mãn. </w:t>
@@ -33606,6 +33875,7 @@
           <w:id w:val="-1875840705"/>
           <w:citation/>
         </w:sdtPr>
+        <w:sdtEndPr/>
         <w:sdtContent>
           <w:r>
             <w:fldChar w:fldCharType="begin"/>
@@ -33719,6 +33989,7 @@
           <w:id w:val="15968341"/>
           <w:citation/>
         </w:sdtPr>
+        <w:sdtEndPr/>
         <w:sdtContent>
           <w:r>
             <w:rPr>
@@ -33820,6 +34091,7 @@
           <w:id w:val="-1360263055"/>
           <w:citation/>
         </w:sdtPr>
+        <w:sdtEndPr/>
         <w:sdtContent>
           <w:r>
             <w:fldChar w:fldCharType="begin"/>
@@ -33903,6 +34175,7 @@
           <w:id w:val="-1912079596"/>
           <w:citation/>
         </w:sdtPr>
+        <w:sdtEndPr/>
         <w:sdtContent>
           <w:r>
             <w:fldChar w:fldCharType="begin"/>
@@ -33956,6 +34229,7 @@
           <w:id w:val="-1117370544"/>
           <w:citation/>
         </w:sdtPr>
+        <w:sdtEndPr/>
         <w:sdtContent>
           <w:r>
             <w:fldChar w:fldCharType="begin"/>
@@ -34006,6 +34280,7 @@
           <w:id w:val="-1896193750"/>
           <w:citation/>
         </w:sdtPr>
+        <w:sdtEndPr/>
         <w:sdtContent>
           <w:r>
             <w:fldChar w:fldCharType="begin"/>
@@ -34083,6 +34358,7 @@
           <w:id w:val="-1164778514"/>
           <w:citation/>
         </w:sdtPr>
+        <w:sdtEndPr/>
         <w:sdtContent>
           <w:r>
             <w:fldChar w:fldCharType="begin"/>
@@ -34892,6 +35168,7 @@
           <w:id w:val="1721552074"/>
           <w:citation/>
         </w:sdtPr>
+        <w:sdtEndPr/>
         <w:sdtContent>
           <w:r>
             <w:fldChar w:fldCharType="begin"/>
@@ -34981,6 +35258,7 @@
           <w:id w:val="-1163398774"/>
           <w:citation/>
         </w:sdtPr>
+        <w:sdtEndPr/>
         <w:sdtContent>
           <w:r>
             <w:fldChar w:fldCharType="begin"/>
@@ -35144,6 +35422,7 @@
           <w:id w:val="439798803"/>
           <w:citation/>
         </w:sdtPr>
+        <w:sdtEndPr/>
         <w:sdtContent>
           <w:r>
             <w:fldChar w:fldCharType="begin"/>
@@ -35198,7 +35477,7 @@
       <w:pPr>
         <w:pStyle w:val="Heading2"/>
       </w:pPr>
-      <w:bookmarkStart w:id="16" w:name="_Toc207378978"/>
+      <w:bookmarkStart w:id="17" w:name="_Toc207378978"/>
       <w:r>
         <w:t>4</w:t>
       </w:r>
@@ -35214,7 +35493,7 @@
       <w:r>
         <w:t>Quản trị &amp; thực thi công lý</w:t>
       </w:r>
-      <w:bookmarkEnd w:id="16"/>
+      <w:bookmarkEnd w:id="17"/>
     </w:p>
     <w:p>
       <w:r>
@@ -35280,6 +35559,7 @@
           <w:id w:val="1656022673"/>
           <w:citation/>
         </w:sdtPr>
+        <w:sdtEndPr/>
         <w:sdtContent>
           <w:r>
             <w:fldChar w:fldCharType="begin"/>
@@ -35546,6 +35826,7 @@
           <w:id w:val="-613753683"/>
           <w:citation/>
         </w:sdtPr>
+        <w:sdtEndPr/>
         <w:sdtContent>
           <w:r>
             <w:fldChar w:fldCharType="begin"/>
@@ -35785,6 +36066,7 @@
           <w:id w:val="-2083064119"/>
           <w:citation/>
         </w:sdtPr>
+        <w:sdtEndPr/>
         <w:sdtContent>
           <w:r>
             <w:fldChar w:fldCharType="begin"/>
@@ -35997,6 +36279,7 @@
           <w:id w:val="617031370"/>
           <w:citation/>
         </w:sdtPr>
+        <w:sdtEndPr/>
         <w:sdtContent>
           <w:r>
             <w:fldChar w:fldCharType="begin"/>
@@ -36047,6 +36330,7 @@
           <w:id w:val="-132101768"/>
           <w:citation/>
         </w:sdtPr>
+        <w:sdtEndPr/>
         <w:sdtContent>
           <w:r>
             <w:fldChar w:fldCharType="begin"/>
@@ -36138,6 +36422,7 @@
           <w:id w:val="582578625"/>
           <w:citation/>
         </w:sdtPr>
+        <w:sdtEndPr/>
         <w:sdtContent>
           <w:r>
             <w:fldChar w:fldCharType="begin"/>
@@ -36185,6 +36470,7 @@
           <w:id w:val="1896697253"/>
           <w:citation/>
         </w:sdtPr>
+        <w:sdtEndPr/>
         <w:sdtContent>
           <w:r>
             <w:fldChar w:fldCharType="begin"/>
@@ -36235,6 +36521,7 @@
           <w:id w:val="1469860253"/>
           <w:citation/>
         </w:sdtPr>
+        <w:sdtEndPr/>
         <w:sdtContent>
           <w:r>
             <w:fldChar w:fldCharType="begin"/>
@@ -36324,6 +36611,7 @@
           <w:id w:val="-1302915980"/>
           <w:citation/>
         </w:sdtPr>
+        <w:sdtEndPr/>
         <w:sdtContent>
           <w:r>
             <w:fldChar w:fldCharType="begin"/>
@@ -36356,6 +36644,7 @@
           <w:id w:val="1013952927"/>
           <w:citation/>
         </w:sdtPr>
+        <w:sdtEndPr/>
         <w:sdtContent>
           <w:r>
             <w:fldChar w:fldCharType="begin"/>
@@ -36421,6 +36710,7 @@
           <w:id w:val="1287854219"/>
           <w:citation/>
         </w:sdtPr>
+        <w:sdtEndPr/>
         <w:sdtContent>
           <w:r>
             <w:fldChar w:fldCharType="begin"/>
@@ -36651,6 +36941,7 @@
           <w:id w:val="-1520610846"/>
           <w:citation/>
         </w:sdtPr>
+        <w:sdtEndPr/>
         <w:sdtContent>
           <w:r>
             <w:fldChar w:fldCharType="begin"/>
@@ -36733,6 +37024,7 @@
           <w:id w:val="-822819058"/>
           <w:citation/>
         </w:sdtPr>
+        <w:sdtEndPr/>
         <w:sdtContent>
           <w:r>
             <w:fldChar w:fldCharType="begin"/>
@@ -36895,6 +37187,7 @@
           <w:id w:val="1515883124"/>
           <w:citation/>
         </w:sdtPr>
+        <w:sdtEndPr/>
         <w:sdtContent>
           <w:r>
             <w:fldChar w:fldCharType="begin"/>
@@ -37013,6 +37306,7 @@
           <w:id w:val="-1097948179"/>
           <w:citation/>
         </w:sdtPr>
+        <w:sdtEndPr/>
         <w:sdtContent>
           <w:r>
             <w:fldChar w:fldCharType="begin"/>
@@ -37102,6 +37396,7 @@
           <w:id w:val="1623346306"/>
           <w:citation/>
         </w:sdtPr>
+        <w:sdtEndPr/>
         <w:sdtContent>
           <w:r>
             <w:fldChar w:fldCharType="begin"/>
@@ -37182,6 +37477,7 @@
           <w:id w:val="2104843148"/>
           <w:citation/>
         </w:sdtPr>
+        <w:sdtEndPr/>
         <w:sdtContent>
           <w:r>
             <w:fldChar w:fldCharType="begin"/>
@@ -37253,6 +37549,7 @@
           <w:id w:val="-1747634338"/>
           <w:citation/>
         </w:sdtPr>
+        <w:sdtEndPr/>
         <w:sdtContent>
           <w:r>
             <w:fldChar w:fldCharType="begin"/>
@@ -37285,6 +37582,7 @@
           <w:id w:val="-575514276"/>
           <w:citation/>
         </w:sdtPr>
+        <w:sdtEndPr/>
         <w:sdtContent>
           <w:r>
             <w:fldChar w:fldCharType="begin"/>
@@ -37384,6 +37682,7 @@
           <w:id w:val="-219667888"/>
           <w:citation/>
         </w:sdtPr>
+        <w:sdtEndPr/>
         <w:sdtContent>
           <w:r>
             <w:fldChar w:fldCharType="begin"/>
@@ -37532,6 +37831,7 @@
           <w:id w:val="2051331570"/>
           <w:citation/>
         </w:sdtPr>
+        <w:sdtEndPr/>
         <w:sdtContent>
           <w:r>
             <w:fldChar w:fldCharType="begin"/>
@@ -37562,7 +37862,7 @@
       <w:pPr>
         <w:pStyle w:val="Heading2"/>
       </w:pPr>
-      <w:bookmarkStart w:id="17" w:name="_Toc207378979"/>
+      <w:bookmarkStart w:id="18" w:name="_Toc207378979"/>
       <w:r>
         <w:t>4</w:t>
       </w:r>
@@ -37578,7 +37878,7 @@
       <w:r>
         <w:t>Cảnh sát &amp; hiệp hội</w:t>
       </w:r>
-      <w:bookmarkEnd w:id="17"/>
+      <w:bookmarkEnd w:id="18"/>
     </w:p>
     <w:p>
       <w:r>
@@ -37628,6 +37928,7 @@
           <w:id w:val="237369661"/>
           <w:citation/>
         </w:sdtPr>
+        <w:sdtEndPr/>
         <w:sdtContent>
           <w:r>
             <w:fldChar w:fldCharType="begin"/>
@@ -37696,6 +37997,7 @@
           <w:id w:val="-1469589788"/>
           <w:citation/>
         </w:sdtPr>
+        <w:sdtEndPr/>
         <w:sdtContent>
           <w:r>
             <w:fldChar w:fldCharType="begin"/>
@@ -37914,6 +38216,7 @@
           <w:id w:val="504627105"/>
           <w:citation/>
         </w:sdtPr>
+        <w:sdtEndPr/>
         <w:sdtContent>
           <w:r>
             <w:fldChar w:fldCharType="begin"/>
@@ -37976,6 +38279,7 @@
           <w:id w:val="1213306337"/>
           <w:citation/>
         </w:sdtPr>
+        <w:sdtEndPr/>
         <w:sdtContent>
           <w:r>
             <w:fldChar w:fldCharType="begin"/>
@@ -38014,6 +38318,7 @@
           <w:id w:val="-2141713892"/>
           <w:citation/>
         </w:sdtPr>
+        <w:sdtEndPr/>
         <w:sdtContent>
           <w:r>
             <w:fldChar w:fldCharType="begin"/>
@@ -38055,6 +38360,7 @@
           <w:id w:val="-488166046"/>
           <w:citation/>
         </w:sdtPr>
+        <w:sdtEndPr/>
         <w:sdtContent>
           <w:r>
             <w:fldChar w:fldCharType="begin"/>
@@ -38134,6 +38440,7 @@
           <w:id w:val="1861851385"/>
           <w:citation/>
         </w:sdtPr>
+        <w:sdtEndPr/>
         <w:sdtContent>
           <w:r>
             <w:fldChar w:fldCharType="begin"/>
@@ -38226,6 +38533,7 @@
           <w:id w:val="827173715"/>
           <w:citation/>
         </w:sdtPr>
+        <w:sdtEndPr/>
         <w:sdtContent>
           <w:r>
             <w:fldChar w:fldCharType="begin"/>
@@ -38441,6 +38749,7 @@
           <w:id w:val="1232281781"/>
           <w:citation/>
         </w:sdtPr>
+        <w:sdtEndPr/>
         <w:sdtContent>
           <w:r>
             <w:fldChar w:fldCharType="begin"/>
@@ -38494,6 +38803,7 @@
           <w:id w:val="773366762"/>
           <w:citation/>
         </w:sdtPr>
+        <w:sdtEndPr/>
         <w:sdtContent>
           <w:r>
             <w:fldChar w:fldCharType="begin"/>
@@ -38547,6 +38857,7 @@
           <w:id w:val="-1176260786"/>
           <w:citation/>
         </w:sdtPr>
+        <w:sdtEndPr/>
         <w:sdtContent>
           <w:r>
             <w:fldChar w:fldCharType="begin"/>
@@ -38663,6 +38974,7 @@
           <w:id w:val="-68192876"/>
           <w:citation/>
         </w:sdtPr>
+        <w:sdtEndPr/>
         <w:sdtContent>
           <w:r>
             <w:fldChar w:fldCharType="begin"/>
@@ -38813,6 +39125,7 @@
           <w:id w:val="500166285"/>
           <w:citation/>
         </w:sdtPr>
+        <w:sdtEndPr/>
         <w:sdtContent>
           <w:r>
             <w:fldChar w:fldCharType="begin"/>
@@ -38910,6 +39223,7 @@
           <w:id w:val="-793602981"/>
           <w:citation/>
         </w:sdtPr>
+        <w:sdtEndPr/>
         <w:sdtContent>
           <w:r>
             <w:fldChar w:fldCharType="begin"/>
@@ -38972,6 +39286,7 @@
           <w:id w:val="902023077"/>
           <w:citation/>
         </w:sdtPr>
+        <w:sdtEndPr/>
         <w:sdtContent>
           <w:r>
             <w:fldChar w:fldCharType="begin"/>
@@ -39004,6 +39319,7 @@
           <w:id w:val="245850661"/>
           <w:citation/>
         </w:sdtPr>
+        <w:sdtEndPr/>
         <w:sdtContent>
           <w:r>
             <w:fldChar w:fldCharType="begin"/>
@@ -39109,6 +39425,7 @@
           <w:id w:val="1635914259"/>
           <w:citation/>
         </w:sdtPr>
+        <w:sdtEndPr/>
         <w:sdtContent>
           <w:r>
             <w:fldChar w:fldCharType="begin"/>
@@ -39458,6 +39775,7 @@
           <w:id w:val="549033337"/>
           <w:citation/>
         </w:sdtPr>
+        <w:sdtEndPr/>
         <w:sdtContent>
           <w:r>
             <w:fldChar w:fldCharType="begin"/>
@@ -39508,6 +39826,7 @@
           <w:id w:val="1630196215"/>
           <w:citation/>
         </w:sdtPr>
+        <w:sdtEndPr/>
         <w:sdtContent>
           <w:r>
             <w:fldChar w:fldCharType="begin"/>
@@ -39567,6 +39886,7 @@
           <w:id w:val="1137381920"/>
           <w:citation/>
         </w:sdtPr>
+        <w:sdtEndPr/>
         <w:sdtContent>
           <w:r>
             <w:fldChar w:fldCharType="begin"/>
@@ -39746,6 +40066,7 @@
           <w:id w:val="-1563561536"/>
           <w:citation/>
         </w:sdtPr>
+        <w:sdtEndPr/>
         <w:sdtContent>
           <w:r>
             <w:fldChar w:fldCharType="begin"/>
@@ -39793,6 +40114,7 @@
           <w:id w:val="808055748"/>
           <w:citation/>
         </w:sdtPr>
+        <w:sdtEndPr/>
         <w:sdtContent>
           <w:r>
             <w:fldChar w:fldCharType="begin"/>
@@ -39822,6 +40144,7 @@
           <w:id w:val="1138222336"/>
           <w:citation/>
         </w:sdtPr>
+        <w:sdtEndPr/>
         <w:sdtContent>
           <w:r>
             <w:fldChar w:fldCharType="begin"/>
@@ -39875,6 +40198,7 @@
           <w:id w:val="507409809"/>
           <w:citation/>
         </w:sdtPr>
+        <w:sdtEndPr/>
         <w:sdtContent>
           <w:r>
             <w:fldChar w:fldCharType="begin"/>
@@ -39973,11 +40297,11 @@
       <w:pPr>
         <w:pStyle w:val="Heading1"/>
       </w:pPr>
-      <w:bookmarkStart w:id="18" w:name="_Toc207378980"/>
+      <w:bookmarkStart w:id="19" w:name="_Toc207378980"/>
       <w:r>
         <w:t>5. Nhà nước</w:t>
       </w:r>
-      <w:bookmarkEnd w:id="18"/>
+      <w:bookmarkEnd w:id="19"/>
     </w:p>
     <w:p>
       <w:r>
@@ -40045,6 +40369,7 @@
           <w:id w:val="307673644"/>
           <w:citation/>
         </w:sdtPr>
+        <w:sdtEndPr/>
         <w:sdtContent>
           <w:r>
             <w:fldChar w:fldCharType="begin"/>
@@ -40083,6 +40408,7 @@
           <w:id w:val="-1865351093"/>
           <w:citation/>
         </w:sdtPr>
+        <w:sdtEndPr/>
         <w:sdtContent>
           <w:r>
             <w:fldChar w:fldCharType="begin"/>
@@ -40208,6 +40534,7 @@
           <w:id w:val="-1547825118"/>
           <w:citation/>
         </w:sdtPr>
+        <w:sdtEndPr/>
         <w:sdtContent>
           <w:r>
             <w:fldChar w:fldCharType="begin"/>
@@ -40279,6 +40606,7 @@
           <w:id w:val="-311334587"/>
           <w:citation/>
         </w:sdtPr>
+        <w:sdtEndPr/>
         <w:sdtContent>
           <w:r>
             <w:fldChar w:fldCharType="begin"/>
@@ -40308,6 +40636,7 @@
           <w:id w:val="286404153"/>
           <w:citation/>
         </w:sdtPr>
+        <w:sdtEndPr/>
         <w:sdtContent>
           <w:r>
             <w:fldChar w:fldCharType="begin"/>
@@ -40398,6 +40727,7 @@
           <w:id w:val="-2112577633"/>
           <w:citation/>
         </w:sdtPr>
+        <w:sdtEndPr/>
         <w:sdtContent>
           <w:r>
             <w:fldChar w:fldCharType="begin"/>
@@ -40466,6 +40796,7 @@
           <w:id w:val="-664703326"/>
           <w:citation/>
         </w:sdtPr>
+        <w:sdtEndPr/>
         <w:sdtContent>
           <w:r>
             <w:fldChar w:fldCharType="begin"/>
@@ -40495,6 +40826,7 @@
           <w:id w:val="810670881"/>
           <w:citation/>
         </w:sdtPr>
+        <w:sdtEndPr/>
         <w:sdtContent>
           <w:r>
             <w:fldChar w:fldCharType="begin"/>
@@ -40556,6 +40888,7 @@
           <w:id w:val="2107766130"/>
           <w:citation/>
         </w:sdtPr>
+        <w:sdtEndPr/>
         <w:sdtContent>
           <w:r>
             <w:fldChar w:fldCharType="begin"/>
@@ -40708,6 +41041,7 @@
           <w:id w:val="714090295"/>
           <w:citation/>
         </w:sdtPr>
+        <w:sdtEndPr/>
         <w:sdtContent>
           <w:r>
             <w:fldChar w:fldCharType="begin"/>
@@ -40807,6 +41141,7 @@
           <w:id w:val="1902014874"/>
           <w:citation/>
         </w:sdtPr>
+        <w:sdtEndPr/>
         <w:sdtContent>
           <w:r>
             <w:fldChar w:fldCharType="begin"/>
@@ -40868,6 +41203,7 @@
           <w:id w:val="1698580328"/>
           <w:citation/>
         </w:sdtPr>
+        <w:sdtEndPr/>
         <w:sdtContent>
           <w:r>
             <w:fldChar w:fldCharType="begin"/>
@@ -40915,6 +41251,7 @@
           <w:id w:val="492379087"/>
           <w:citation/>
         </w:sdtPr>
+        <w:sdtEndPr/>
         <w:sdtContent>
           <w:r>
             <w:fldChar w:fldCharType="begin"/>
@@ -41238,6 +41575,7 @@
           <w:id w:val="-688528805"/>
           <w:citation/>
         </w:sdtPr>
+        <w:sdtEndPr/>
         <w:sdtContent>
           <w:r>
             <w:fldChar w:fldCharType="begin"/>
@@ -41283,7 +41621,7 @@
       <w:pPr>
         <w:pStyle w:val="Heading2"/>
       </w:pPr>
-      <w:bookmarkStart w:id="19" w:name="_Toc207378981"/>
+      <w:bookmarkStart w:id="20" w:name="_Toc207378981"/>
       <w:r>
         <w:t>5</w:t>
       </w:r>
@@ -41299,7 +41637,7 @@
       <w:r>
         <w:t>Công pháp nội bộ</w:t>
       </w:r>
-      <w:bookmarkEnd w:id="19"/>
+      <w:bookmarkEnd w:id="20"/>
     </w:p>
     <w:p>
       <w:r>
@@ -41436,6 +41774,7 @@
           <w:id w:val="415983440"/>
           <w:citation/>
         </w:sdtPr>
+        <w:sdtEndPr/>
         <w:sdtContent>
           <w:r>
             <w:fldChar w:fldCharType="begin"/>
@@ -41486,6 +41825,7 @@
           <w:id w:val="-410233403"/>
           <w:citation/>
         </w:sdtPr>
+        <w:sdtEndPr/>
         <w:sdtContent>
           <w:r>
             <w:fldChar w:fldCharType="begin"/>
@@ -41582,6 +41922,7 @@
           <w:id w:val="1136061877"/>
           <w:citation/>
         </w:sdtPr>
+        <w:sdtEndPr/>
         <w:sdtContent>
           <w:r>
             <w:fldChar w:fldCharType="begin"/>
@@ -41617,6 +41958,7 @@
           <w:id w:val="-2131154587"/>
           <w:citation/>
         </w:sdtPr>
+        <w:sdtEndPr/>
         <w:sdtContent>
           <w:r>
             <w:fldChar w:fldCharType="begin"/>
@@ -41690,6 +42032,7 @@
           <w:id w:val="-23560801"/>
           <w:citation/>
         </w:sdtPr>
+        <w:sdtEndPr/>
         <w:sdtContent>
           <w:r>
             <w:fldChar w:fldCharType="begin"/>
@@ -41749,6 +42092,7 @@
           <w:id w:val="-670021664"/>
           <w:citation/>
         </w:sdtPr>
+        <w:sdtEndPr/>
         <w:sdtContent>
           <w:r>
             <w:fldChar w:fldCharType="begin"/>
@@ -41925,6 +42269,7 @@
           <w:id w:val="-1848012891"/>
           <w:citation/>
         </w:sdtPr>
+        <w:sdtEndPr/>
         <w:sdtContent>
           <w:r>
             <w:fldChar w:fldCharType="begin"/>
@@ -41963,6 +42308,7 @@
           <w:id w:val="-353272612"/>
           <w:citation/>
         </w:sdtPr>
+        <w:sdtEndPr/>
         <w:sdtContent>
           <w:r>
             <w:fldChar w:fldCharType="begin"/>
@@ -42022,6 +42368,7 @@
           <w:id w:val="-1242864539"/>
           <w:citation/>
         </w:sdtPr>
+        <w:sdtEndPr/>
         <w:sdtContent>
           <w:r>
             <w:fldChar w:fldCharType="begin"/>
@@ -42051,6 +42398,7 @@
           <w:id w:val="-905760196"/>
           <w:citation/>
         </w:sdtPr>
+        <w:sdtEndPr/>
         <w:sdtContent>
           <w:r>
             <w:fldChar w:fldCharType="begin"/>
@@ -42215,6 +42563,7 @@
           <w:id w:val="-461806240"/>
           <w:citation/>
         </w:sdtPr>
+        <w:sdtEndPr/>
         <w:sdtContent>
           <w:r>
             <w:fldChar w:fldCharType="begin"/>
@@ -42283,6 +42632,7 @@
           <w:id w:val="835039902"/>
           <w:citation/>
         </w:sdtPr>
+        <w:sdtEndPr/>
         <w:sdtContent>
           <w:r>
             <w:fldChar w:fldCharType="begin"/>
@@ -42387,6 +42737,7 @@
           <w:id w:val="-687902844"/>
           <w:citation/>
         </w:sdtPr>
+        <w:sdtEndPr/>
         <w:sdtContent>
           <w:r>
             <w:fldChar w:fldCharType="begin"/>
@@ -42476,6 +42827,7 @@
           <w:id w:val="-1249034535"/>
           <w:citation/>
         </w:sdtPr>
+        <w:sdtEndPr/>
         <w:sdtContent>
           <w:r>
             <w:fldChar w:fldCharType="begin"/>
@@ -42511,6 +42863,7 @@
           <w:id w:val="675232344"/>
           <w:citation/>
         </w:sdtPr>
+        <w:sdtEndPr/>
         <w:sdtContent>
           <w:r>
             <w:fldChar w:fldCharType="begin"/>
@@ -42906,6 +43259,7 @@
           <w:id w:val="-1170560558"/>
           <w:citation/>
         </w:sdtPr>
+        <w:sdtEndPr/>
         <w:sdtContent>
           <w:r>
             <w:fldChar w:fldCharType="begin"/>
@@ -42953,6 +43307,7 @@
           <w:id w:val="608857169"/>
           <w:citation/>
         </w:sdtPr>
+        <w:sdtEndPr/>
         <w:sdtContent>
           <w:r>
             <w:rPr>
@@ -43041,6 +43396,7 @@
           <w:id w:val="-1359963589"/>
           <w:citation/>
         </w:sdtPr>
+        <w:sdtEndPr/>
         <w:sdtContent>
           <w:r>
             <w:fldChar w:fldCharType="begin"/>
@@ -43152,6 +43508,7 @@
           <w:id w:val="-837845375"/>
           <w:citation/>
         </w:sdtPr>
+        <w:sdtEndPr/>
         <w:sdtContent>
           <w:r>
             <w:rPr>
@@ -43224,6 +43581,7 @@
           <w:id w:val="2059508281"/>
           <w:citation/>
         </w:sdtPr>
+        <w:sdtEndPr/>
         <w:sdtContent>
           <w:r>
             <w:fldChar w:fldCharType="begin"/>
@@ -43692,6 +44050,7 @@
           <w:id w:val="-1098254219"/>
           <w:citation/>
         </w:sdtPr>
+        <w:sdtEndPr/>
         <w:sdtContent>
           <w:r>
             <w:fldChar w:fldCharType="begin"/>
@@ -43934,6 +44293,7 @@
           <w:id w:val="442194814"/>
           <w:citation/>
         </w:sdtPr>
+        <w:sdtEndPr/>
         <w:sdtContent>
           <w:r>
             <w:fldChar w:fldCharType="begin"/>
@@ -43990,6 +44350,7 @@
           <w:id w:val="244763718"/>
           <w:citation/>
         </w:sdtPr>
+        <w:sdtEndPr/>
         <w:sdtContent>
           <w:r>
             <w:fldChar w:fldCharType="begin"/>
@@ -44028,6 +44389,7 @@
           <w:id w:val="765113086"/>
           <w:citation/>
         </w:sdtPr>
+        <w:sdtEndPr/>
         <w:sdtContent>
           <w:r>
             <w:fldChar w:fldCharType="begin"/>
@@ -44123,6 +44485,7 @@
           <w:id w:val="-1956865431"/>
           <w:citation/>
         </w:sdtPr>
+        <w:sdtEndPr/>
         <w:sdtContent>
           <w:r>
             <w:fldChar w:fldCharType="begin"/>
@@ -44159,6 +44522,7 @@
           <w:id w:val="-740017946"/>
           <w:citation/>
         </w:sdtPr>
+        <w:sdtEndPr/>
         <w:sdtContent>
           <w:r>
             <w:fldChar w:fldCharType="begin"/>
@@ -44191,6 +44555,7 @@
           <w:id w:val="273600502"/>
           <w:citation/>
         </w:sdtPr>
+        <w:sdtEndPr/>
         <w:sdtContent>
           <w:r>
             <w:fldChar w:fldCharType="begin"/>
@@ -44247,6 +44612,7 @@
           <w:id w:val="-634265042"/>
           <w:citation/>
         </w:sdtPr>
+        <w:sdtEndPr/>
         <w:sdtContent>
           <w:r>
             <w:fldChar w:fldCharType="begin"/>
@@ -44354,6 +44720,7 @@
           <w:id w:val="-1381931497"/>
           <w:citation/>
         </w:sdtPr>
+        <w:sdtEndPr/>
         <w:sdtContent>
           <w:r>
             <w:fldChar w:fldCharType="begin"/>
@@ -44455,6 +44822,7 @@
           <w:id w:val="-1361431884"/>
           <w:citation/>
         </w:sdtPr>
+        <w:sdtEndPr/>
         <w:sdtContent>
           <w:r>
             <w:fldChar w:fldCharType="begin"/>
@@ -44538,6 +44906,7 @@
           <w:id w:val="-2101554080"/>
           <w:citation/>
         </w:sdtPr>
+        <w:sdtEndPr/>
         <w:sdtContent>
           <w:r>
             <w:fldChar w:fldCharType="begin"/>
@@ -44675,6 +45044,7 @@
           <w:id w:val="-1612199177"/>
           <w:citation/>
         </w:sdtPr>
+        <w:sdtEndPr/>
         <w:sdtContent>
           <w:r>
             <w:fldChar w:fldCharType="begin"/>
@@ -44791,6 +45161,7 @@
           <w:id w:val="594442363"/>
           <w:citation/>
         </w:sdtPr>
+        <w:sdtEndPr/>
         <w:sdtContent>
           <w:r>
             <w:fldChar w:fldCharType="begin"/>
@@ -44853,6 +45224,7 @@
           <w:id w:val="340744124"/>
           <w:citation/>
         </w:sdtPr>
+        <w:sdtEndPr/>
         <w:sdtContent>
           <w:r>
             <w:fldChar w:fldCharType="begin"/>
@@ -44906,6 +45278,7 @@
           <w:id w:val="-1791362167"/>
           <w:citation/>
         </w:sdtPr>
+        <w:sdtEndPr/>
         <w:sdtContent>
           <w:r>
             <w:fldChar w:fldCharType="begin"/>
@@ -45354,6 +45727,7 @@
           <w:id w:val="-2101172144"/>
           <w:citation/>
         </w:sdtPr>
+        <w:sdtEndPr/>
         <w:sdtContent>
           <w:r>
             <w:fldChar w:fldCharType="begin"/>
@@ -45443,6 +45817,7 @@
           <w:id w:val="-1045761577"/>
           <w:citation/>
         </w:sdtPr>
+        <w:sdtEndPr/>
         <w:sdtContent>
           <w:r>
             <w:fldChar w:fldCharType="begin"/>
@@ -45481,6 +45856,7 @@
           <w:id w:val="-54860199"/>
           <w:citation/>
         </w:sdtPr>
+        <w:sdtEndPr/>
         <w:sdtContent>
           <w:r>
             <w:fldChar w:fldCharType="begin"/>
@@ -45538,6 +45914,7 @@
           <w:id w:val="1406735153"/>
           <w:citation/>
         </w:sdtPr>
+        <w:sdtEndPr/>
         <w:sdtContent>
           <w:r>
             <w:fldChar w:fldCharType="begin"/>
@@ -45600,6 +45977,7 @@
           <w:id w:val="-1700383135"/>
           <w:citation/>
         </w:sdtPr>
+        <w:sdtEndPr/>
         <w:sdtContent>
           <w:r>
             <w:fldChar w:fldCharType="begin"/>
@@ -45647,6 +46025,7 @@
           <w:id w:val="1723243205"/>
           <w:citation/>
         </w:sdtPr>
+        <w:sdtEndPr/>
         <w:sdtContent>
           <w:r>
             <w:fldChar w:fldCharType="begin"/>
@@ -45691,6 +46070,7 @@
           <w:id w:val="1452665812"/>
           <w:citation/>
         </w:sdtPr>
+        <w:sdtEndPr/>
         <w:sdtContent>
           <w:r>
             <w:fldChar w:fldCharType="begin"/>
@@ -45738,6 +46118,7 @@
           <w:id w:val="659197781"/>
           <w:citation/>
         </w:sdtPr>
+        <w:sdtEndPr/>
         <w:sdtContent>
           <w:r>
             <w:fldChar w:fldCharType="begin"/>
@@ -45815,6 +46196,7 @@
           <w:id w:val="1388998641"/>
           <w:citation/>
         </w:sdtPr>
+        <w:sdtEndPr/>
         <w:sdtContent>
           <w:r>
             <w:fldChar w:fldCharType="begin"/>
@@ -45993,6 +46375,7 @@
           <w:id w:val="-1939513377"/>
           <w:citation/>
         </w:sdtPr>
+        <w:sdtEndPr/>
         <w:sdtContent>
           <w:r>
             <w:fldChar w:fldCharType="begin"/>
@@ -46071,6 +46454,7 @@
           <w:id w:val="-717902680"/>
           <w:citation/>
         </w:sdtPr>
+        <w:sdtEndPr/>
         <w:sdtContent>
           <w:r>
             <w:fldChar w:fldCharType="begin"/>
@@ -46216,6 +46600,7 @@
           <w:id w:val="-594710290"/>
           <w:citation/>
         </w:sdtPr>
+        <w:sdtEndPr/>
         <w:sdtContent>
           <w:r>
             <w:rPr>
@@ -46270,6 +46655,7 @@
           <w:id w:val="2009947177"/>
           <w:citation/>
         </w:sdtPr>
+        <w:sdtEndPr/>
         <w:sdtContent>
           <w:r>
             <w:rPr>
@@ -46784,6 +47170,7 @@
           <w:id w:val="364178017"/>
           <w:citation/>
         </w:sdtPr>
+        <w:sdtEndPr/>
         <w:sdtContent>
           <w:r>
             <w:fldChar w:fldCharType="begin"/>
@@ -46846,6 +47233,7 @@
           <w:id w:val="628909309"/>
           <w:citation/>
         </w:sdtPr>
+        <w:sdtEndPr/>
         <w:sdtContent>
           <w:r>
             <w:fldChar w:fldCharType="begin"/>
@@ -46941,6 +47329,7 @@
           <w:id w:val="358712401"/>
           <w:citation/>
         </w:sdtPr>
+        <w:sdtEndPr/>
         <w:sdtContent>
           <w:r>
             <w:fldChar w:fldCharType="begin"/>
@@ -46979,6 +47368,7 @@
           <w:id w:val="-90700414"/>
           <w:citation/>
         </w:sdtPr>
+        <w:sdtEndPr/>
         <w:sdtContent>
           <w:r>
             <w:fldChar w:fldCharType="begin"/>
@@ -47032,6 +47422,7 @@
           <w:id w:val="286244550"/>
           <w:citation/>
         </w:sdtPr>
+        <w:sdtEndPr/>
         <w:sdtContent>
           <w:r>
             <w:fldChar w:fldCharType="begin"/>
@@ -47091,6 +47482,7 @@
           <w:id w:val="1935007746"/>
           <w:citation/>
         </w:sdtPr>
+        <w:sdtEndPr/>
         <w:sdtContent>
           <w:r>
             <w:fldChar w:fldCharType="begin"/>
@@ -47228,6 +47620,7 @@
           <w:id w:val="-1175882026"/>
           <w:citation/>
         </w:sdtPr>
+        <w:sdtEndPr/>
         <w:sdtContent>
           <w:r>
             <w:fldChar w:fldCharType="begin"/>
@@ -47313,6 +47706,7 @@
           <w:id w:val="-166796755"/>
           <w:citation/>
         </w:sdtPr>
+        <w:sdtEndPr/>
         <w:sdtContent>
           <w:r>
             <w:fldChar w:fldCharType="begin"/>
@@ -47490,6 +47884,7 @@
           <w:id w:val="-1645040747"/>
           <w:citation/>
         </w:sdtPr>
+        <w:sdtEndPr/>
         <w:sdtContent>
           <w:r>
             <w:fldChar w:fldCharType="begin"/>
@@ -47546,6 +47941,7 @@
           <w:id w:val="-912396162"/>
           <w:citation/>
         </w:sdtPr>
+        <w:sdtEndPr/>
         <w:sdtContent>
           <w:r>
             <w:fldChar w:fldCharType="begin"/>
@@ -47631,6 +48027,7 @@
           <w:id w:val="1795634649"/>
           <w:citation/>
         </w:sdtPr>
+        <w:sdtEndPr/>
         <w:sdtContent>
           <w:r>
             <w:fldChar w:fldCharType="begin"/>
@@ -47775,6 +48172,7 @@
           <w:id w:val="838432794"/>
           <w:citation/>
         </w:sdtPr>
+        <w:sdtEndPr/>
         <w:sdtContent>
           <w:r>
             <w:fldChar w:fldCharType="begin"/>
@@ -47807,6 +48205,7 @@
           <w:id w:val="28311556"/>
           <w:citation/>
         </w:sdtPr>
+        <w:sdtEndPr/>
         <w:sdtContent>
           <w:r>
             <w:fldChar w:fldCharType="begin"/>
@@ -47899,7 +48298,7 @@
       <w:pPr>
         <w:pStyle w:val="Heading2"/>
       </w:pPr>
-      <w:bookmarkStart w:id="20" w:name="_Toc207378982"/>
+      <w:bookmarkStart w:id="21" w:name="_Toc207378982"/>
       <w:r>
         <w:t>5</w:t>
       </w:r>
@@ -47915,7 +48314,7 @@
       <w:r>
         <w:t>Công pháp quốc tế</w:t>
       </w:r>
-      <w:bookmarkEnd w:id="20"/>
+      <w:bookmarkEnd w:id="21"/>
     </w:p>
     <w:p>
       <w:r>
@@ -47962,6 +48361,7 @@
           <w:id w:val="-1861660002"/>
           <w:citation/>
         </w:sdtPr>
+        <w:sdtEndPr/>
         <w:sdtContent>
           <w:r>
             <w:fldChar w:fldCharType="begin"/>
@@ -48052,6 +48452,7 @@
           <w:id w:val="-1842311994"/>
           <w:citation/>
         </w:sdtPr>
+        <w:sdtEndPr/>
         <w:sdtContent>
           <w:r>
             <w:fldChar w:fldCharType="begin"/>
@@ -48272,6 +48673,7 @@
           <w:id w:val="-2051524414"/>
           <w:citation/>
         </w:sdtPr>
+        <w:sdtEndPr/>
         <w:sdtContent>
           <w:r>
             <w:fldChar w:fldCharType="begin"/>
@@ -48340,6 +48742,7 @@
           <w:id w:val="-773321741"/>
           <w:citation/>
         </w:sdtPr>
+        <w:sdtEndPr/>
         <w:sdtContent>
           <w:r>
             <w:fldChar w:fldCharType="begin"/>
@@ -48414,6 +48817,7 @@
           <w:id w:val="715397520"/>
           <w:citation/>
         </w:sdtPr>
+        <w:sdtEndPr/>
         <w:sdtContent>
           <w:r>
             <w:fldChar w:fldCharType="begin"/>
@@ -48467,6 +48871,7 @@
           <w:id w:val="-180440926"/>
           <w:citation/>
         </w:sdtPr>
+        <w:sdtEndPr/>
         <w:sdtContent>
           <w:r>
             <w:fldChar w:fldCharType="begin"/>
@@ -48499,6 +48904,7 @@
           <w:id w:val="1129449188"/>
           <w:citation/>
         </w:sdtPr>
+        <w:sdtEndPr/>
         <w:sdtContent>
           <w:r>
             <w:fldChar w:fldCharType="begin"/>
@@ -48531,6 +48937,7 @@
           <w:id w:val="-1734000774"/>
           <w:citation/>
         </w:sdtPr>
+        <w:sdtEndPr/>
         <w:sdtContent>
           <w:r>
             <w:fldChar w:fldCharType="begin"/>
@@ -48573,6 +48980,7 @@
           <w:id w:val="-1718039427"/>
           <w:citation/>
         </w:sdtPr>
+        <w:sdtEndPr/>
         <w:sdtContent>
           <w:r>
             <w:fldChar w:fldCharType="begin"/>
@@ -48608,6 +49016,7 @@
           <w:id w:val="-1687052443"/>
           <w:citation/>
         </w:sdtPr>
+        <w:sdtEndPr/>
         <w:sdtContent>
           <w:r>
             <w:fldChar w:fldCharType="begin"/>
@@ -48666,6 +49075,7 @@
           <w:id w:val="894929420"/>
           <w:citation/>
         </w:sdtPr>
+        <w:sdtEndPr/>
         <w:sdtContent>
           <w:r>
             <w:fldChar w:fldCharType="begin"/>
@@ -48695,6 +49105,7 @@
           <w:id w:val="1709769312"/>
           <w:citation/>
         </w:sdtPr>
+        <w:sdtEndPr/>
         <w:sdtContent>
           <w:r>
             <w:fldChar w:fldCharType="begin"/>
@@ -48836,7 +49247,7 @@
       <w:pPr>
         <w:pStyle w:val="Heading2"/>
       </w:pPr>
-      <w:bookmarkStart w:id="21" w:name="_Toc207378983"/>
+      <w:bookmarkStart w:id="22" w:name="_Toc207378983"/>
       <w:r>
         <w:t>5</w:t>
       </w:r>
@@ -48852,7 +49263,7 @@
       <w:r>
         <w:t>Tinh thần thế giới</w:t>
       </w:r>
-      <w:bookmarkEnd w:id="21"/>
+      <w:bookmarkEnd w:id="22"/>
     </w:p>
     <w:p>
       <w:r>
@@ -48938,6 +49349,7 @@
           <w:id w:val="-323829128"/>
           <w:citation/>
         </w:sdtPr>
+        <w:sdtEndPr/>
         <w:sdtContent>
           <w:r>
             <w:fldChar w:fldCharType="begin"/>
@@ -48967,6 +49379,7 @@
           <w:id w:val="1155182856"/>
           <w:citation/>
         </w:sdtPr>
+        <w:sdtEndPr/>
         <w:sdtContent>
           <w:r>
             <w:fldChar w:fldCharType="begin"/>
@@ -48999,6 +49412,7 @@
           <w:id w:val="1496386951"/>
           <w:citation/>
         </w:sdtPr>
+        <w:sdtEndPr/>
         <w:sdtContent>
           <w:r>
             <w:fldChar w:fldCharType="begin"/>
@@ -49062,6 +49476,7 @@
           <w:id w:val="-646279836"/>
           <w:citation/>
         </w:sdtPr>
+        <w:sdtEndPr/>
         <w:sdtContent>
           <w:r>
             <w:fldChar w:fldCharType="begin"/>
@@ -49166,6 +49581,7 @@
           <w:id w:val="1717320029"/>
           <w:citation/>
         </w:sdtPr>
+        <w:sdtEndPr/>
         <w:sdtContent>
           <w:r>
             <w:fldChar w:fldCharType="begin"/>
@@ -49275,6 +49691,7 @@
           <w:id w:val="-1546677481"/>
           <w:citation/>
         </w:sdtPr>
+        <w:sdtEndPr/>
         <w:sdtContent>
           <w:r>
             <w:fldChar w:fldCharType="begin"/>
@@ -49319,6 +49736,7 @@
           <w:id w:val="-931889077"/>
           <w:citation/>
         </w:sdtPr>
+        <w:sdtEndPr/>
         <w:sdtContent>
           <w:r>
             <w:fldChar w:fldCharType="begin"/>
@@ -49372,6 +49790,7 @@
           <w:id w:val="-1503044420"/>
           <w:citation/>
         </w:sdtPr>
+        <w:sdtEndPr/>
         <w:sdtContent>
           <w:r>
             <w:fldChar w:fldCharType="begin"/>
@@ -49446,6 +49865,7 @@
           <w:id w:val="1696576884"/>
           <w:citation/>
         </w:sdtPr>
+        <w:sdtEndPr/>
         <w:sdtContent>
           <w:r>
             <w:fldChar w:fldCharType="begin"/>
@@ -49487,6 +49907,7 @@
           <w:id w:val="490910401"/>
           <w:citation/>
         </w:sdtPr>
+        <w:sdtEndPr/>
         <w:sdtContent>
           <w:r>
             <w:fldChar w:fldCharType="begin"/>
@@ -49547,6 +49968,7 @@
           <w:id w:val="-862046956"/>
           <w:citation/>
         </w:sdtPr>
+        <w:sdtEndPr/>
         <w:sdtContent>
           <w:r>
             <w:fldChar w:fldCharType="begin"/>
@@ -49624,6 +50046,7 @@
           <w:id w:val="259112171"/>
           <w:citation/>
         </w:sdtPr>
+        <w:sdtEndPr/>
         <w:sdtContent>
           <w:r>
             <w:fldChar w:fldCharType="begin"/>
@@ -49679,6 +50102,7 @@
           <w:id w:val="-1976981596"/>
           <w:citation/>
         </w:sdtPr>
+        <w:sdtEndPr/>
         <w:sdtContent>
           <w:r>
             <w:fldChar w:fldCharType="begin"/>
@@ -49711,6 +50135,7 @@
           <w:id w:val="-77221019"/>
           <w:citation/>
         </w:sdtPr>
+        <w:sdtEndPr/>
         <w:sdtContent>
           <w:r>
             <w:fldChar w:fldCharType="begin"/>
@@ -49761,6 +50186,7 @@
           <w:id w:val="1394852885"/>
           <w:citation/>
         </w:sdtPr>
+        <w:sdtEndPr/>
         <w:sdtContent>
           <w:r>
             <w:fldChar w:fldCharType="begin"/>
@@ -49796,6 +50222,7 @@
           <w:id w:val="994383176"/>
           <w:citation/>
         </w:sdtPr>
+        <w:sdtEndPr/>
         <w:sdtContent>
           <w:r>
             <w:fldChar w:fldCharType="begin"/>
@@ -49855,6 +50282,7 @@
           <w:id w:val="-793822198"/>
           <w:citation/>
         </w:sdtPr>
+        <w:sdtEndPr/>
         <w:sdtContent>
           <w:r>
             <w:fldChar w:fldCharType="begin"/>
@@ -49911,6 +50339,7 @@
           <w:id w:val="896860123"/>
           <w:citation/>
         </w:sdtPr>
+        <w:sdtEndPr/>
         <w:sdtContent>
           <w:r>
             <w:fldChar w:fldCharType="begin"/>
@@ -50078,6 +50507,7 @@
           <w:id w:val="-1897188561"/>
           <w:citation/>
         </w:sdtPr>
+        <w:sdtEndPr/>
         <w:sdtContent>
           <w:r>
             <w:fldChar w:fldCharType="begin"/>
@@ -50137,6 +50567,7 @@
           <w:id w:val="1469621777"/>
           <w:citation/>
         </w:sdtPr>
+        <w:sdtEndPr/>
         <w:sdtContent>
           <w:r>
             <w:fldChar w:fldCharType="begin"/>
@@ -50169,6 +50600,7 @@
           <w:id w:val="2042467459"/>
           <w:citation/>
         </w:sdtPr>
+        <w:sdtEndPr/>
         <w:sdtContent>
           <w:r>
             <w:fldChar w:fldCharType="begin"/>
@@ -50228,6 +50660,7 @@
           <w:id w:val="-1067101123"/>
           <w:citation/>
         </w:sdtPr>
+        <w:sdtEndPr/>
         <w:sdtContent>
           <w:r>
             <w:fldChar w:fldCharType="begin"/>
@@ -50290,6 +50723,7 @@
           <w:id w:val="2131826735"/>
           <w:citation/>
         </w:sdtPr>
+        <w:sdtEndPr/>
         <w:sdtContent>
           <w:r>
             <w:fldChar w:fldCharType="begin"/>
@@ -50331,6 +50765,7 @@
           <w:id w:val="-194698771"/>
           <w:citation/>
         </w:sdtPr>
+        <w:sdtEndPr/>
         <w:sdtContent>
           <w:r>
             <w:fldChar w:fldCharType="begin"/>
@@ -50385,11 +50820,11 @@
       <w:pPr>
         <w:pStyle w:val="Heading1"/>
       </w:pPr>
-      <w:bookmarkStart w:id="22" w:name="_Toc207378984"/>
+      <w:bookmarkStart w:id="23" w:name="_Toc207378984"/>
       <w:r>
         <w:t>Thay lời kết</w:t>
       </w:r>
-      <w:bookmarkEnd w:id="22"/>
+      <w:bookmarkEnd w:id="23"/>
     </w:p>
     <w:p>
       <w:r>
@@ -50540,11 +50975,11 @@
       <w:pPr>
         <w:pStyle w:val="Heading1"/>
       </w:pPr>
-      <w:bookmarkStart w:id="23" w:name="_Toc207378985"/>
+      <w:bookmarkStart w:id="24" w:name="_Toc207378985"/>
       <w:r>
         <w:t>Lời cảm ơn</w:t>
       </w:r>
-      <w:bookmarkEnd w:id="23"/>
+      <w:bookmarkEnd w:id="24"/>
     </w:p>
     <w:p>
       <w:r>
@@ -50600,24 +51035,24 @@
       <w:pPr>
         <w:pStyle w:val="Heading1"/>
       </w:pPr>
-      <w:bookmarkStart w:id="24" w:name="_Toc207378986"/>
+      <w:bookmarkStart w:id="25" w:name="_Toc207378986"/>
       <w:r>
         <w:t>Phụ lục</w:t>
       </w:r>
-      <w:bookmarkEnd w:id="24"/>
+      <w:bookmarkEnd w:id="25"/>
     </w:p>
     <w:p>
       <w:pPr>
         <w:pStyle w:val="Heading2"/>
       </w:pPr>
-      <w:bookmarkStart w:id="25" w:name="_Toc207378987"/>
+      <w:bookmarkStart w:id="26" w:name="_Toc207378987"/>
       <w:r>
         <w:t xml:space="preserve">Phụ lục 1: </w:t>
       </w:r>
       <w:r>
         <w:t>hiện tượng học tinh thần Hegel</w:t>
       </w:r>
-      <w:bookmarkEnd w:id="25"/>
+      <w:bookmarkEnd w:id="26"/>
     </w:p>
     <w:p>
       <w:r>
@@ -51203,12 +51638,12 @@
       <w:pPr>
         <w:pStyle w:val="Heading2"/>
       </w:pPr>
-      <w:bookmarkStart w:id="26" w:name="_Toc207378988"/>
+      <w:bookmarkStart w:id="27" w:name="_Toc207378988"/>
       <w:r>
         <w:lastRenderedPageBreak/>
         <w:t>Phụ lục 2: thuyết âm dương &amp; mô hình tư biện</w:t>
       </w:r>
-      <w:bookmarkEnd w:id="26"/>
+      <w:bookmarkEnd w:id="27"/>
     </w:p>
     <w:p>
       <w:r>
@@ -52174,11 +52609,11 @@
       <w:pPr>
         <w:pStyle w:val="Heading2"/>
       </w:pPr>
-      <w:bookmarkStart w:id="27" w:name="_Toc207378989"/>
+      <w:bookmarkStart w:id="28" w:name="_Toc207378989"/>
       <w:r>
         <w:t>Phụ lục 3: lập trình hướng đối tượng</w:t>
       </w:r>
-      <w:bookmarkEnd w:id="27"/>
+      <w:bookmarkEnd w:id="28"/>
     </w:p>
     <w:p>
       <w:r>
@@ -54345,8 +54780,6 @@
       <w:r>
         <w:t xml:space="preserve"> Trừng phạt phi pháp là phương thức của pháp quyền trừu tượng nhưng hành động là thuộc tính của luân lý.</w:t>
       </w:r>
-      <w:bookmarkStart w:id="28" w:name="_GoBack"/>
-      <w:bookmarkEnd w:id="28"/>
     </w:p>
     <w:p/>
     <w:p>
@@ -56631,7 +57064,7 @@
           <w:rPr>
             <w:noProof/>
           </w:rPr>
-          <w:t>102</w:t>
+          <w:t>5</w:t>
         </w:r>
         <w:r>
           <w:rPr>
@@ -57803,7 +58236,7 @@
 </file>
 
 <file path=customXml/itemProps1.xml><?xml version="1.0" encoding="utf-8"?>
-<ds:datastoreItem xmlns:ds="http://schemas.openxmlformats.org/officeDocument/2006/customXml" ds:itemID="{45B96EBC-4F1B-4630-801B-E2047C696C2B}">
+<ds:datastoreItem xmlns:ds="http://schemas.openxmlformats.org/officeDocument/2006/customXml" ds:itemID="{90352AA0-E89A-4693-8A80-109CF6206840}">
   <ds:schemaRefs>
     <ds:schemaRef ds:uri="http://schemas.openxmlformats.org/officeDocument/2006/bibliography"/>
   </ds:schemaRefs>

</xml_diff>